<commit_message>
init: create asp.net week1 mini stationery api
</commit_message>
<xml_diff>
--- a/Labs_1/Lab1.docx
+++ b/Labs_1/Lab1.docx
@@ -8,16 +8,12 @@
         <w:rPr>
           <w:b/>
           <w:bCs/>
-          <w:sz w:val="36"/>
-          <w:szCs w:val="36"/>
-        </w:rPr>
-      </w:pPr>
-      <w:r>
-        <w:rPr>
-          <w:b/>
-          <w:bCs/>
-          <w:sz w:val="36"/>
-          <w:szCs w:val="36"/>
+        </w:rPr>
+      </w:pPr>
+      <w:r>
+        <w:rPr>
+          <w:b/>
+          <w:bCs/>
         </w:rPr>
         <w:t>23110156_NguyenMinhHoang__ASP_Lab01</w:t>
       </w:r>
@@ -27,8 +23,6 @@
         <w:rPr>
           <w:b/>
           <w:bCs/>
-          <w:sz w:val="32"/>
-          <w:szCs w:val="32"/>
           <w:u w:val="single"/>
         </w:rPr>
       </w:pPr>
@@ -36,8 +30,6 @@
         <w:rPr>
           <w:b/>
           <w:bCs/>
-          <w:sz w:val="32"/>
-          <w:szCs w:val="32"/>
         </w:rPr>
         <w:t xml:space="preserve">Câu 1: </w:t>
       </w:r>
@@ -45,8 +37,6 @@
         <w:rPr>
           <w:b/>
           <w:bCs/>
-          <w:sz w:val="32"/>
-          <w:szCs w:val="32"/>
           <w:u w:val="single"/>
         </w:rPr>
         <w:t>Mini Stationery Api</w:t>
@@ -55,138 +45,71 @@
         <w:rPr>
           <w:b/>
           <w:bCs/>
-          <w:sz w:val="28"/>
-          <w:szCs w:val="28"/>
           <w:u w:val="single"/>
         </w:rPr>
         <w:br/>
       </w:r>
       <w:r>
-        <w:rPr>
-          <w:sz w:val="28"/>
-          <w:szCs w:val="28"/>
-        </w:rPr>
         <w:t xml:space="preserve">Một cửa hàng văn phòng phẩm nhỏ </w:t>
       </w:r>
       <w:r>
-        <w:rPr>
-          <w:sz w:val="28"/>
-          <w:szCs w:val="28"/>
-        </w:rPr>
         <w:t>cần hệ thống API đơn giản để</w:t>
       </w:r>
       <w:r>
-        <w:rPr>
-          <w:sz w:val="28"/>
-          <w:szCs w:val="28"/>
-        </w:rPr>
         <w:t xml:space="preserve"> quản lý</w:t>
       </w:r>
       <w:r>
-        <w:rPr>
-          <w:sz w:val="28"/>
-          <w:szCs w:val="28"/>
-        </w:rPr>
         <w:t>:</w:t>
       </w:r>
     </w:p>
     <w:p>
-      <w:pPr>
-        <w:rPr>
-          <w:sz w:val="28"/>
-          <w:szCs w:val="28"/>
-        </w:rPr>
-      </w:pPr>
-      <w:r>
-        <w:rPr>
-          <w:sz w:val="28"/>
-          <w:szCs w:val="28"/>
-        </w:rPr>
-        <w:t>+ Trả về danh sách các sản phẩm (products) như bút, giấy, dụng cụ vẽ,…</w:t>
-      </w:r>
-    </w:p>
-    <w:p>
-      <w:pPr>
-        <w:rPr>
-          <w:sz w:val="28"/>
-          <w:szCs w:val="28"/>
-        </w:rPr>
-      </w:pPr>
-      <w:r>
-        <w:rPr>
-          <w:sz w:val="28"/>
-          <w:szCs w:val="28"/>
-        </w:rPr>
+      <w:r>
+        <w:t xml:space="preserve">+ Trả về danh sách các sản phẩm (products) như bút, giấy, dụng cụ </w:t>
+      </w:r>
+      <w:proofErr w:type="gramStart"/>
+      <w:r>
+        <w:t>vẽ,…</w:t>
+      </w:r>
+      <w:proofErr w:type="gramEnd"/>
+    </w:p>
+    <w:p>
+      <w:r>
         <w:t>+ Cho biết tồn kho của từng mặt hàng.</w:t>
       </w:r>
     </w:p>
     <w:p>
-      <w:pPr>
-        <w:rPr>
-          <w:sz w:val="28"/>
-          <w:szCs w:val="28"/>
-        </w:rPr>
-      </w:pPr>
-      <w:r>
-        <w:rPr>
-          <w:sz w:val="28"/>
-          <w:szCs w:val="28"/>
-        </w:rPr>
+      <w:r>
         <w:t>+ Phân loại các mặt hàng theo từng nhóm.</w:t>
       </w:r>
     </w:p>
     <w:p>
-      <w:pPr>
-        <w:rPr>
-          <w:sz w:val="28"/>
-          <w:szCs w:val="28"/>
-        </w:rPr>
-      </w:pPr>
-      <w:r>
-        <w:rPr>
-          <w:sz w:val="28"/>
-          <w:szCs w:val="28"/>
-        </w:rPr>
+      <w:r>
         <w:t>+ Lên đơn thanh toán khi khách hàng mua hàng.</w:t>
       </w:r>
     </w:p>
     <w:p>
-      <w:pPr>
-        <w:rPr>
-          <w:sz w:val="28"/>
-          <w:szCs w:val="28"/>
-        </w:rPr>
-      </w:pPr>
-      <w:r>
-        <w:rPr>
-          <w:sz w:val="28"/>
-          <w:szCs w:val="28"/>
-        </w:rPr>
+      <w:r>
         <w:t>+ Cho biết ứng dụng đang chạy ở môi trường nào.</w:t>
       </w:r>
     </w:p>
     <w:p>
-      <w:pPr>
-        <w:rPr>
-          <w:sz w:val="28"/>
-          <w:szCs w:val="28"/>
-        </w:rPr>
-      </w:pPr>
-      <w:r>
-        <w:rPr>
-          <w:sz w:val="28"/>
-          <w:szCs w:val="28"/>
-        </w:rPr>
-        <w:t>+ Đọc một số cấu hình cơ bản từ appsettings.json.</w:t>
-      </w:r>
-    </w:p>
-    <w:p>
-      <w:pPr>
-        <w:rPr>
-          <w:b/>
-          <w:bCs/>
-          <w:sz w:val="32"/>
-          <w:szCs w:val="32"/>
+      <w:r>
+        <w:t xml:space="preserve">+ Đọc một số cấu hình cơ bản từ </w:t>
+      </w:r>
+      <w:proofErr w:type="gramStart"/>
+      <w:r>
+        <w:t>appsettings.json</w:t>
+      </w:r>
+      <w:proofErr w:type="gramEnd"/>
+      <w:r>
+        <w:t>.</w:t>
+      </w:r>
+    </w:p>
+    <w:p>
+      <w:pPr>
+        <w:rPr>
+          <w:b/>
+          <w:bCs/>
           <w:u w:val="single"/>
         </w:rPr>
       </w:pPr>
@@ -194,38 +117,22 @@
         <w:rPr>
           <w:b/>
           <w:bCs/>
-          <w:sz w:val="32"/>
-          <w:szCs w:val="32"/>
           <w:u w:val="single"/>
         </w:rPr>
-        <w:t>Models</w:t>
-      </w:r>
-      <w:r>
-        <w:rPr>
-          <w:b/>
-          <w:bCs/>
-          <w:sz w:val="32"/>
-          <w:szCs w:val="32"/>
-          <w:u w:val="single"/>
-        </w:rPr>
-        <w:t>:</w:t>
-      </w:r>
-    </w:p>
-    <w:p>
-      <w:pPr>
-        <w:rPr>
-          <w:b/>
-          <w:bCs/>
-          <w:sz w:val="32"/>
-          <w:szCs w:val="32"/>
-        </w:rPr>
-      </w:pPr>
-      <w:r>
-        <w:rPr>
-          <w:b/>
-          <w:bCs/>
-          <w:sz w:val="32"/>
-          <w:szCs w:val="32"/>
+        <w:t>Models:</w:t>
+      </w:r>
+    </w:p>
+    <w:p>
+      <w:pPr>
+        <w:rPr>
+          <w:b/>
+          <w:bCs/>
+        </w:rPr>
+      </w:pPr>
+      <w:r>
+        <w:rPr>
+          <w:b/>
+          <w:bCs/>
         </w:rPr>
         <w:t>Product:</w:t>
       </w:r>
@@ -235,16 +142,13 @@
         <w:rPr>
           <w:b/>
           <w:bCs/>
-          <w:sz w:val="32"/>
-          <w:szCs w:val="32"/>
-        </w:rPr>
-      </w:pPr>
-      <w:r>
-        <w:rPr>
-          <w:b/>
-          <w:bCs/>
-          <w:sz w:val="32"/>
-          <w:szCs w:val="32"/>
+        </w:rPr>
+      </w:pPr>
+      <w:r>
+        <w:rPr>
+          <w:b/>
+          <w:bCs/>
+          <w:noProof/>
         </w:rPr>
         <w:drawing>
           <wp:inline distT="0" distB="0" distL="0" distR="0" wp14:anchorId="55CAA9BA" wp14:editId="34722D1A">
@@ -288,16 +192,12 @@
         <w:rPr>
           <w:b/>
           <w:bCs/>
-          <w:sz w:val="32"/>
-          <w:szCs w:val="32"/>
-        </w:rPr>
-      </w:pPr>
-      <w:r>
-        <w:rPr>
-          <w:b/>
-          <w:bCs/>
-          <w:sz w:val="32"/>
-          <w:szCs w:val="32"/>
+        </w:rPr>
+      </w:pPr>
+      <w:r>
+        <w:rPr>
+          <w:b/>
+          <w:bCs/>
         </w:rPr>
         <w:t>Category:</w:t>
       </w:r>
@@ -307,16 +207,13 @@
         <w:rPr>
           <w:b/>
           <w:bCs/>
-          <w:sz w:val="32"/>
-          <w:szCs w:val="32"/>
-        </w:rPr>
-      </w:pPr>
-      <w:r>
-        <w:rPr>
-          <w:b/>
-          <w:bCs/>
-          <w:sz w:val="32"/>
-          <w:szCs w:val="32"/>
+        </w:rPr>
+      </w:pPr>
+      <w:r>
+        <w:rPr>
+          <w:b/>
+          <w:bCs/>
+          <w:noProof/>
         </w:rPr>
         <w:drawing>
           <wp:inline distT="0" distB="0" distL="0" distR="0" wp14:anchorId="080F8A3C" wp14:editId="52A0572D">
@@ -360,16 +257,12 @@
         <w:rPr>
           <w:b/>
           <w:bCs/>
-          <w:sz w:val="32"/>
-          <w:szCs w:val="32"/>
-        </w:rPr>
-      </w:pPr>
-      <w:r>
-        <w:rPr>
-          <w:b/>
-          <w:bCs/>
-          <w:sz w:val="32"/>
-          <w:szCs w:val="32"/>
+        </w:rPr>
+      </w:pPr>
+      <w:r>
+        <w:rPr>
+          <w:b/>
+          <w:bCs/>
         </w:rPr>
         <w:t>Order:</w:t>
       </w:r>
@@ -379,16 +272,13 @@
         <w:rPr>
           <w:b/>
           <w:bCs/>
-          <w:sz w:val="32"/>
-          <w:szCs w:val="32"/>
-        </w:rPr>
-      </w:pPr>
-      <w:r>
-        <w:rPr>
-          <w:b/>
-          <w:bCs/>
-          <w:sz w:val="32"/>
-          <w:szCs w:val="32"/>
+        </w:rPr>
+      </w:pPr>
+      <w:r>
+        <w:rPr>
+          <w:b/>
+          <w:bCs/>
+          <w:noProof/>
         </w:rPr>
         <w:lastRenderedPageBreak/>
         <w:drawing>
@@ -433,8 +323,6 @@
         <w:rPr>
           <w:b/>
           <w:bCs/>
-          <w:sz w:val="32"/>
-          <w:szCs w:val="32"/>
           <w:u w:val="single"/>
         </w:rPr>
       </w:pPr>
@@ -442,8 +330,6 @@
         <w:rPr>
           <w:b/>
           <w:bCs/>
-          <w:sz w:val="32"/>
-          <w:szCs w:val="32"/>
           <w:u w:val="single"/>
         </w:rPr>
         <w:t>Services:</w:t>
@@ -454,16 +340,12 @@
         <w:rPr>
           <w:b/>
           <w:bCs/>
-          <w:sz w:val="32"/>
-          <w:szCs w:val="32"/>
-        </w:rPr>
-      </w:pPr>
-      <w:r>
-        <w:rPr>
-          <w:b/>
-          <w:bCs/>
-          <w:sz w:val="32"/>
-          <w:szCs w:val="32"/>
+        </w:rPr>
+      </w:pPr>
+      <w:r>
+        <w:rPr>
+          <w:b/>
+          <w:bCs/>
         </w:rPr>
         <w:t>ProductService:</w:t>
       </w:r>
@@ -473,16 +355,13 @@
         <w:rPr>
           <w:b/>
           <w:bCs/>
-          <w:sz w:val="32"/>
-          <w:szCs w:val="32"/>
-        </w:rPr>
-      </w:pPr>
-      <w:r>
-        <w:rPr>
-          <w:b/>
-          <w:bCs/>
-          <w:sz w:val="32"/>
-          <w:szCs w:val="32"/>
+        </w:rPr>
+      </w:pPr>
+      <w:r>
+        <w:rPr>
+          <w:b/>
+          <w:bCs/>
+          <w:noProof/>
         </w:rPr>
         <w:drawing>
           <wp:inline distT="0" distB="0" distL="0" distR="0" wp14:anchorId="58F3144D" wp14:editId="702D0A8A">
@@ -526,26 +405,21 @@
         <w:rPr>
           <w:b/>
           <w:bCs/>
-          <w:sz w:val="32"/>
-          <w:szCs w:val="32"/>
-        </w:rPr>
-      </w:pPr>
-    </w:p>
-    <w:p>
-      <w:pPr>
-        <w:rPr>
-          <w:b/>
-          <w:bCs/>
-          <w:sz w:val="32"/>
-          <w:szCs w:val="32"/>
-        </w:rPr>
-      </w:pPr>
-      <w:r>
-        <w:rPr>
-          <w:b/>
-          <w:bCs/>
-          <w:sz w:val="32"/>
-          <w:szCs w:val="32"/>
+        </w:rPr>
+      </w:pPr>
+    </w:p>
+    <w:p>
+      <w:pPr>
+        <w:rPr>
+          <w:b/>
+          <w:bCs/>
+        </w:rPr>
+      </w:pPr>
+      <w:r>
+        <w:rPr>
+          <w:b/>
+          <w:bCs/>
+          <w:noProof/>
         </w:rPr>
         <w:lastRenderedPageBreak/>
         <w:drawing>
@@ -590,16 +464,13 @@
         <w:rPr>
           <w:b/>
           <w:bCs/>
-          <w:sz w:val="32"/>
-          <w:szCs w:val="32"/>
-        </w:rPr>
-      </w:pPr>
-      <w:r>
-        <w:rPr>
-          <w:b/>
-          <w:bCs/>
-          <w:sz w:val="32"/>
-          <w:szCs w:val="32"/>
+        </w:rPr>
+      </w:pPr>
+      <w:r>
+        <w:rPr>
+          <w:b/>
+          <w:bCs/>
+          <w:noProof/>
         </w:rPr>
         <w:drawing>
           <wp:inline distT="0" distB="0" distL="0" distR="0" wp14:anchorId="542B64F8" wp14:editId="46C0927C">
@@ -643,35 +514,37 @@
         <w:rPr>
           <w:b/>
           <w:bCs/>
-          <w:sz w:val="32"/>
-          <w:szCs w:val="32"/>
-        </w:rPr>
-      </w:pPr>
-      <w:r>
-        <w:rPr>
-          <w:b/>
-          <w:bCs/>
-          <w:sz w:val="32"/>
-          <w:szCs w:val="32"/>
-        </w:rPr>
-        <w:t>CategoryService:</w:t>
-      </w:r>
-    </w:p>
-    <w:p>
-      <w:pPr>
-        <w:rPr>
-          <w:b/>
-          <w:bCs/>
-          <w:sz w:val="32"/>
-          <w:szCs w:val="32"/>
-        </w:rPr>
-      </w:pPr>
-      <w:r>
-        <w:rPr>
-          <w:b/>
-          <w:bCs/>
-          <w:sz w:val="32"/>
-          <w:szCs w:val="32"/>
+        </w:rPr>
+      </w:pPr>
+      <w:proofErr w:type="gramStart"/>
+      <w:r>
+        <w:rPr>
+          <w:b/>
+          <w:bCs/>
+        </w:rPr>
+        <w:t>CategoryService</w:t>
+      </w:r>
+      <w:proofErr w:type="gramEnd"/>
+      <w:r>
+        <w:rPr>
+          <w:b/>
+          <w:bCs/>
+        </w:rPr>
+        <w:t>:</w:t>
+      </w:r>
+    </w:p>
+    <w:p>
+      <w:pPr>
+        <w:rPr>
+          <w:b/>
+          <w:bCs/>
+        </w:rPr>
+      </w:pPr>
+      <w:r>
+        <w:rPr>
+          <w:b/>
+          <w:bCs/>
+          <w:noProof/>
         </w:rPr>
         <w:lastRenderedPageBreak/>
         <w:drawing>
@@ -716,35 +589,37 @@
         <w:rPr>
           <w:b/>
           <w:bCs/>
-          <w:sz w:val="32"/>
-          <w:szCs w:val="32"/>
-        </w:rPr>
-      </w:pPr>
-      <w:r>
-        <w:rPr>
-          <w:b/>
-          <w:bCs/>
-          <w:sz w:val="32"/>
-          <w:szCs w:val="32"/>
-        </w:rPr>
-        <w:t>OrderService:</w:t>
-      </w:r>
-    </w:p>
-    <w:p>
-      <w:pPr>
-        <w:rPr>
-          <w:b/>
-          <w:bCs/>
-          <w:sz w:val="32"/>
-          <w:szCs w:val="32"/>
-        </w:rPr>
-      </w:pPr>
-      <w:r>
-        <w:rPr>
-          <w:b/>
-          <w:bCs/>
-          <w:sz w:val="32"/>
-          <w:szCs w:val="32"/>
+        </w:rPr>
+      </w:pPr>
+      <w:proofErr w:type="gramStart"/>
+      <w:r>
+        <w:rPr>
+          <w:b/>
+          <w:bCs/>
+        </w:rPr>
+        <w:t>OrderService</w:t>
+      </w:r>
+      <w:proofErr w:type="gramEnd"/>
+      <w:r>
+        <w:rPr>
+          <w:b/>
+          <w:bCs/>
+        </w:rPr>
+        <w:t>:</w:t>
+      </w:r>
+    </w:p>
+    <w:p>
+      <w:pPr>
+        <w:rPr>
+          <w:b/>
+          <w:bCs/>
+        </w:rPr>
+      </w:pPr>
+      <w:r>
+        <w:rPr>
+          <w:b/>
+          <w:bCs/>
+          <w:noProof/>
         </w:rPr>
         <w:drawing>
           <wp:inline distT="0" distB="0" distL="0" distR="0" wp14:anchorId="584F3CAF" wp14:editId="2B6BA03A">
@@ -788,8 +663,6 @@
         <w:rPr>
           <w:b/>
           <w:bCs/>
-          <w:sz w:val="32"/>
-          <w:szCs w:val="32"/>
           <w:u w:val="single"/>
         </w:rPr>
       </w:pPr>
@@ -797,38 +670,22 @@
         <w:rPr>
           <w:b/>
           <w:bCs/>
-          <w:sz w:val="32"/>
-          <w:szCs w:val="32"/>
           <w:u w:val="single"/>
         </w:rPr>
-        <w:t>Controllers</w:t>
-      </w:r>
-      <w:r>
-        <w:rPr>
-          <w:b/>
-          <w:bCs/>
-          <w:sz w:val="32"/>
-          <w:szCs w:val="32"/>
-          <w:u w:val="single"/>
-        </w:rPr>
-        <w:t>:</w:t>
-      </w:r>
-    </w:p>
-    <w:p>
-      <w:pPr>
-        <w:rPr>
-          <w:b/>
-          <w:bCs/>
-          <w:sz w:val="32"/>
-          <w:szCs w:val="32"/>
-        </w:rPr>
-      </w:pPr>
-      <w:r>
-        <w:rPr>
-          <w:b/>
-          <w:bCs/>
-          <w:sz w:val="32"/>
-          <w:szCs w:val="32"/>
+        <w:t>Controllers:</w:t>
+      </w:r>
+    </w:p>
+    <w:p>
+      <w:pPr>
+        <w:rPr>
+          <w:b/>
+          <w:bCs/>
+        </w:rPr>
+      </w:pPr>
+      <w:r>
+        <w:rPr>
+          <w:b/>
+          <w:bCs/>
         </w:rPr>
         <w:lastRenderedPageBreak/>
         <w:t>ProductController:</w:t>
@@ -839,8 +696,6 @@
         <w:rPr>
           <w:b/>
           <w:bCs/>
-          <w:sz w:val="32"/>
-          <w:szCs w:val="32"/>
           <w:u w:val="single"/>
         </w:rPr>
       </w:pPr>
@@ -848,8 +703,7 @@
         <w:rPr>
           <w:b/>
           <w:bCs/>
-          <w:sz w:val="32"/>
-          <w:szCs w:val="32"/>
+          <w:noProof/>
           <w:u w:val="single"/>
         </w:rPr>
         <w:drawing>
@@ -894,16 +748,13 @@
         <w:rPr>
           <w:b/>
           <w:bCs/>
-          <w:sz w:val="32"/>
-          <w:szCs w:val="32"/>
-        </w:rPr>
-      </w:pPr>
-      <w:r>
-        <w:rPr>
-          <w:b/>
-          <w:bCs/>
-          <w:sz w:val="32"/>
-          <w:szCs w:val="32"/>
+        </w:rPr>
+      </w:pPr>
+      <w:r>
+        <w:rPr>
+          <w:b/>
+          <w:bCs/>
+          <w:noProof/>
         </w:rPr>
         <w:drawing>
           <wp:inline distT="0" distB="0" distL="0" distR="0" wp14:anchorId="5AD138FA" wp14:editId="3B3EC6D2">
@@ -947,37 +798,30 @@
         <w:rPr>
           <w:b/>
           <w:bCs/>
-          <w:sz w:val="32"/>
-          <w:szCs w:val="32"/>
-        </w:rPr>
-      </w:pPr>
-      <w:r>
-        <w:rPr>
-          <w:b/>
-          <w:bCs/>
-          <w:sz w:val="32"/>
-          <w:szCs w:val="32"/>
+        </w:rPr>
+      </w:pPr>
+      <w:r>
+        <w:rPr>
+          <w:b/>
+          <w:bCs/>
+        </w:rPr>
+        <w:t>CategoryController:</w:t>
+      </w:r>
+    </w:p>
+    <w:p>
+      <w:pPr>
+        <w:rPr>
+          <w:b/>
+          <w:bCs/>
+        </w:rPr>
+      </w:pPr>
+      <w:r>
+        <w:rPr>
+          <w:b/>
+          <w:bCs/>
+          <w:noProof/>
         </w:rPr>
         <w:lastRenderedPageBreak/>
-        <w:t>CategoryController:</w:t>
-      </w:r>
-    </w:p>
-    <w:p>
-      <w:pPr>
-        <w:rPr>
-          <w:b/>
-          <w:bCs/>
-          <w:sz w:val="32"/>
-          <w:szCs w:val="32"/>
-        </w:rPr>
-      </w:pPr>
-      <w:r>
-        <w:rPr>
-          <w:b/>
-          <w:bCs/>
-          <w:sz w:val="32"/>
-          <w:szCs w:val="32"/>
-        </w:rPr>
         <w:drawing>
           <wp:inline distT="0" distB="0" distL="0" distR="0" wp14:anchorId="0A695E29" wp14:editId="16ADFA68">
             <wp:extent cx="4847947" cy="3638550"/>
@@ -1020,16 +864,12 @@
         <w:rPr>
           <w:b/>
           <w:bCs/>
-          <w:sz w:val="32"/>
-          <w:szCs w:val="32"/>
-        </w:rPr>
-      </w:pPr>
-      <w:r>
-        <w:rPr>
-          <w:b/>
-          <w:bCs/>
-          <w:sz w:val="32"/>
-          <w:szCs w:val="32"/>
+        </w:rPr>
+      </w:pPr>
+      <w:r>
+        <w:rPr>
+          <w:b/>
+          <w:bCs/>
         </w:rPr>
         <w:t>OrderController:</w:t>
       </w:r>
@@ -1039,16 +879,13 @@
         <w:rPr>
           <w:b/>
           <w:bCs/>
-          <w:sz w:val="32"/>
-          <w:szCs w:val="32"/>
-        </w:rPr>
-      </w:pPr>
-      <w:r>
-        <w:rPr>
-          <w:b/>
-          <w:bCs/>
-          <w:sz w:val="32"/>
-          <w:szCs w:val="32"/>
+        </w:rPr>
+      </w:pPr>
+      <w:r>
+        <w:rPr>
+          <w:b/>
+          <w:bCs/>
+          <w:noProof/>
         </w:rPr>
         <w:drawing>
           <wp:inline distT="0" distB="0" distL="0" distR="0" wp14:anchorId="46A7D977" wp14:editId="00DE8E9B">
@@ -1092,8 +929,6 @@
         <w:rPr>
           <w:b/>
           <w:bCs/>
-          <w:sz w:val="32"/>
-          <w:szCs w:val="32"/>
           <w:u w:val="single"/>
         </w:rPr>
       </w:pPr>
@@ -1101,30 +936,25 @@
         <w:rPr>
           <w:b/>
           <w:bCs/>
-          <w:sz w:val="32"/>
-          <w:szCs w:val="32"/>
           <w:u w:val="single"/>
         </w:rPr>
+        <w:t>Program.cs:</w:t>
+      </w:r>
+    </w:p>
+    <w:p>
+      <w:pPr>
+        <w:rPr>
+          <w:b/>
+          <w:bCs/>
+        </w:rPr>
+      </w:pPr>
+      <w:r>
+        <w:rPr>
+          <w:b/>
+          <w:bCs/>
+          <w:noProof/>
+        </w:rPr>
         <w:lastRenderedPageBreak/>
-        <w:t>Program.cs:</w:t>
-      </w:r>
-    </w:p>
-    <w:p>
-      <w:pPr>
-        <w:rPr>
-          <w:b/>
-          <w:bCs/>
-          <w:sz w:val="32"/>
-          <w:szCs w:val="32"/>
-        </w:rPr>
-      </w:pPr>
-      <w:r>
-        <w:rPr>
-          <w:b/>
-          <w:bCs/>
-          <w:sz w:val="32"/>
-          <w:szCs w:val="32"/>
-        </w:rPr>
         <w:drawing>
           <wp:inline distT="0" distB="0" distL="0" distR="0" wp14:anchorId="58A90145" wp14:editId="3593FBFC">
             <wp:extent cx="5943600" cy="6496050"/>
@@ -1167,16 +997,12 @@
         <w:rPr>
           <w:b/>
           <w:bCs/>
-          <w:sz w:val="32"/>
-          <w:szCs w:val="32"/>
-        </w:rPr>
-      </w:pPr>
-      <w:r>
-        <w:rPr>
-          <w:b/>
-          <w:bCs/>
-          <w:sz w:val="32"/>
-          <w:szCs w:val="32"/>
+        </w:rPr>
+      </w:pPr>
+      <w:r>
+        <w:rPr>
+          <w:b/>
+          <w:bCs/>
         </w:rPr>
         <w:t xml:space="preserve">Các chức năng: </w:t>
       </w:r>
@@ -1191,23 +1017,15 @@
         <w:rPr>
           <w:b/>
           <w:bCs/>
-          <w:sz w:val="32"/>
-          <w:szCs w:val="32"/>
-        </w:rPr>
-      </w:pPr>
-      <w:r>
-        <w:rPr>
-          <w:sz w:val="32"/>
-          <w:szCs w:val="32"/>
-        </w:rPr>
+        </w:rPr>
+      </w:pPr>
+      <w:r>
         <w:t xml:space="preserve"> </w:t>
       </w:r>
       <w:r>
         <w:rPr>
           <w:b/>
           <w:bCs/>
-          <w:sz w:val="32"/>
-          <w:szCs w:val="32"/>
         </w:rPr>
         <w:t xml:space="preserve">Endpoint </w:t>
       </w:r>
@@ -1215,77 +1033,33 @@
         <w:rPr>
           <w:b/>
           <w:bCs/>
-          <w:sz w:val="32"/>
-          <w:szCs w:val="32"/>
-        </w:rPr>
-        <w:t xml:space="preserve">Get </w:t>
-      </w:r>
-      <w:r>
-        <w:rPr>
-          <w:b/>
-          <w:bCs/>
-          <w:sz w:val="32"/>
-          <w:szCs w:val="32"/>
-        </w:rPr>
-        <w:t>“</w:t>
-      </w:r>
-      <w:r>
-        <w:rPr>
-          <w:b/>
-          <w:bCs/>
-          <w:sz w:val="32"/>
-          <w:szCs w:val="32"/>
-        </w:rPr>
-        <w:t>/</w:t>
-      </w:r>
-      <w:r>
-        <w:rPr>
-          <w:b/>
-          <w:bCs/>
-          <w:sz w:val="32"/>
-          <w:szCs w:val="32"/>
-        </w:rPr>
-        <w:t>”</w:t>
-      </w:r>
-      <w:r>
-        <w:rPr>
-          <w:b/>
-          <w:bCs/>
-          <w:sz w:val="32"/>
-          <w:szCs w:val="32"/>
-        </w:rPr>
-        <w:t xml:space="preserve"> để kiểm tra app chạy</w:t>
-      </w:r>
-    </w:p>
-    <w:p>
-      <w:pPr>
-        <w:pStyle w:val="ListParagraph"/>
-        <w:rPr>
-          <w:b/>
-          <w:bCs/>
-          <w:sz w:val="32"/>
-          <w:szCs w:val="32"/>
-        </w:rPr>
-      </w:pPr>
-    </w:p>
-    <w:p>
-      <w:pPr>
-        <w:pStyle w:val="ListParagraph"/>
-        <w:rPr>
-          <w:b/>
-          <w:bCs/>
-          <w:sz w:val="32"/>
-          <w:szCs w:val="32"/>
-        </w:rPr>
-      </w:pPr>
-      <w:r>
-        <w:rPr>
-          <w:b/>
-          <w:bCs/>
-          <w:sz w:val="32"/>
-          <w:szCs w:val="32"/>
-        </w:rPr>
-        <w:lastRenderedPageBreak/>
+        </w:rPr>
+        <w:t>Get “/” để kiểm tra app chạy</w:t>
+      </w:r>
+    </w:p>
+    <w:p>
+      <w:pPr>
+        <w:pStyle w:val="ListParagraph"/>
+        <w:rPr>
+          <w:b/>
+          <w:bCs/>
+        </w:rPr>
+      </w:pPr>
+    </w:p>
+    <w:p>
+      <w:pPr>
+        <w:pStyle w:val="ListParagraph"/>
+        <w:rPr>
+          <w:b/>
+          <w:bCs/>
+        </w:rPr>
+      </w:pPr>
+      <w:r>
+        <w:rPr>
+          <w:b/>
+          <w:bCs/>
+          <w:noProof/>
+        </w:rPr>
         <w:drawing>
           <wp:inline distT="0" distB="0" distL="0" distR="0" wp14:anchorId="53A39670" wp14:editId="2FE0CD69">
             <wp:extent cx="5114925" cy="1621912"/>
@@ -1329,16 +1103,12 @@
         <w:rPr>
           <w:b/>
           <w:bCs/>
-          <w:sz w:val="32"/>
-          <w:szCs w:val="32"/>
-        </w:rPr>
-      </w:pPr>
-      <w:r>
-        <w:rPr>
-          <w:b/>
-          <w:bCs/>
-          <w:sz w:val="32"/>
-          <w:szCs w:val="32"/>
+        </w:rPr>
+      </w:pPr>
+      <w:r>
+        <w:rPr>
+          <w:b/>
+          <w:bCs/>
         </w:rPr>
         <w:t>Sau khi Execute:</w:t>
       </w:r>
@@ -1349,17 +1119,15 @@
         <w:rPr>
           <w:b/>
           <w:bCs/>
-          <w:sz w:val="32"/>
-          <w:szCs w:val="32"/>
-        </w:rPr>
-      </w:pPr>
-      <w:r>
-        <w:rPr>
-          <w:b/>
-          <w:bCs/>
-          <w:sz w:val="32"/>
-          <w:szCs w:val="32"/>
-        </w:rPr>
+        </w:rPr>
+      </w:pPr>
+      <w:r>
+        <w:rPr>
+          <w:b/>
+          <w:bCs/>
+          <w:noProof/>
+        </w:rPr>
+        <w:lastRenderedPageBreak/>
         <w:drawing>
           <wp:inline distT="0" distB="0" distL="0" distR="0" wp14:anchorId="71D49ADE" wp14:editId="67FBAB48">
             <wp:extent cx="5024438" cy="2268512"/>
@@ -1407,16 +1175,12 @@
         <w:rPr>
           <w:b/>
           <w:bCs/>
-          <w:sz w:val="32"/>
-          <w:szCs w:val="32"/>
-        </w:rPr>
-      </w:pPr>
-      <w:r>
-        <w:rPr>
-          <w:b/>
-          <w:bCs/>
-          <w:sz w:val="32"/>
-          <w:szCs w:val="32"/>
+        </w:rPr>
+      </w:pPr>
+      <w:r>
+        <w:rPr>
+          <w:b/>
+          <w:bCs/>
         </w:rPr>
         <w:t>Endpoint Get “/env”</w:t>
       </w:r>
@@ -1424,8 +1188,6 @@
         <w:rPr>
           <w:b/>
           <w:bCs/>
-          <w:sz w:val="32"/>
-          <w:szCs w:val="32"/>
         </w:rPr>
         <w:t xml:space="preserve"> để kiểm tra xem là môi trường hiện tại là Production hay Development?</w:t>
       </w:r>
@@ -1436,16 +1198,13 @@
         <w:rPr>
           <w:b/>
           <w:bCs/>
-          <w:sz w:val="32"/>
-          <w:szCs w:val="32"/>
-        </w:rPr>
-      </w:pPr>
-      <w:r>
-        <w:rPr>
-          <w:b/>
-          <w:bCs/>
-          <w:sz w:val="32"/>
-          <w:szCs w:val="32"/>
+        </w:rPr>
+      </w:pPr>
+      <w:r>
+        <w:rPr>
+          <w:b/>
+          <w:bCs/>
+          <w:noProof/>
         </w:rPr>
         <w:drawing>
           <wp:inline distT="0" distB="0" distL="0" distR="0" wp14:anchorId="5D285843" wp14:editId="5C5D8814">
@@ -1487,8 +1246,6 @@
         <w:rPr>
           <w:b/>
           <w:bCs/>
-          <w:sz w:val="32"/>
-          <w:szCs w:val="32"/>
         </w:rPr>
         <w:t xml:space="preserve"> </w:t>
       </w:r>
@@ -1499,16 +1256,12 @@
         <w:rPr>
           <w:b/>
           <w:bCs/>
-          <w:sz w:val="32"/>
-          <w:szCs w:val="32"/>
-        </w:rPr>
-      </w:pPr>
-      <w:r>
-        <w:rPr>
-          <w:b/>
-          <w:bCs/>
-          <w:sz w:val="32"/>
-          <w:szCs w:val="32"/>
+        </w:rPr>
+      </w:pPr>
+      <w:r>
+        <w:rPr>
+          <w:b/>
+          <w:bCs/>
         </w:rPr>
         <w:t>Sau khi execute:</w:t>
       </w:r>
@@ -1519,16 +1272,13 @@
         <w:rPr>
           <w:b/>
           <w:bCs/>
-          <w:sz w:val="32"/>
-          <w:szCs w:val="32"/>
-        </w:rPr>
-      </w:pPr>
-      <w:r>
-        <w:rPr>
-          <w:b/>
-          <w:bCs/>
-          <w:sz w:val="32"/>
-          <w:szCs w:val="32"/>
+        </w:rPr>
+      </w:pPr>
+      <w:r>
+        <w:rPr>
+          <w:b/>
+          <w:bCs/>
+          <w:noProof/>
         </w:rPr>
         <w:drawing>
           <wp:inline distT="0" distB="0" distL="0" distR="0" wp14:anchorId="6F76EA90" wp14:editId="1D68EAAD">
@@ -1577,55 +1327,1442 @@
         <w:rPr>
           <w:b/>
           <w:bCs/>
-          <w:sz w:val="32"/>
-          <w:szCs w:val="32"/>
-        </w:rPr>
-      </w:pPr>
-      <w:r>
-        <w:rPr>
-          <w:b/>
-          <w:bCs/>
-          <w:sz w:val="32"/>
-          <w:szCs w:val="32"/>
-        </w:rPr>
+        </w:rPr>
+      </w:pPr>
+      <w:r>
+        <w:rPr>
+          <w:b/>
+          <w:bCs/>
+        </w:rPr>
+        <w:t xml:space="preserve">Endpoint Get “/config” dùng </w:t>
+      </w:r>
+      <w:r>
+        <w:rPr>
+          <w:b/>
+          <w:bCs/>
+        </w:rPr>
+        <w:t xml:space="preserve">để </w:t>
+      </w:r>
+      <w:r>
+        <w:rPr>
+          <w:b/>
+          <w:bCs/>
+        </w:rPr>
+        <w:t>kiểm tra appName và version</w:t>
+      </w:r>
+    </w:p>
+    <w:p>
+      <w:pPr>
+        <w:ind w:left="720"/>
+        <w:rPr>
+          <w:b/>
+          <w:bCs/>
+        </w:rPr>
+      </w:pPr>
+      <w:r>
+        <w:rPr>
+          <w:b/>
+          <w:bCs/>
+        </w:rPr>
+        <w:drawing>
+          <wp:inline distT="0" distB="0" distL="0" distR="0" wp14:anchorId="2E5DFDE5" wp14:editId="376D19CA">
+            <wp:extent cx="5607050" cy="197085"/>
+            <wp:effectExtent l="0" t="0" r="0" b="0"/>
+            <wp:docPr id="1097173339" name="Picture 1"/>
+            <wp:cNvGraphicFramePr>
+              <a:graphicFrameLocks xmlns:a="http://schemas.openxmlformats.org/drawingml/2006/main" noChangeAspect="1"/>
+            </wp:cNvGraphicFramePr>
+            <a:graphic xmlns:a="http://schemas.openxmlformats.org/drawingml/2006/main">
+              <a:graphicData uri="http://schemas.openxmlformats.org/drawingml/2006/picture">
+                <pic:pic xmlns:pic="http://schemas.openxmlformats.org/drawingml/2006/picture">
+                  <pic:nvPicPr>
+                    <pic:cNvPr id="1097173339" name=""/>
+                    <pic:cNvPicPr/>
+                  </pic:nvPicPr>
+                  <pic:blipFill>
+                    <a:blip r:embed="rId22"/>
+                    <a:stretch>
+                      <a:fillRect/>
+                    </a:stretch>
+                  </pic:blipFill>
+                  <pic:spPr>
+                    <a:xfrm>
+                      <a:off x="0" y="0"/>
+                      <a:ext cx="5626932" cy="197784"/>
+                    </a:xfrm>
+                    <a:prstGeom prst="rect">
+                      <a:avLst/>
+                    </a:prstGeom>
+                  </pic:spPr>
+                </pic:pic>
+              </a:graphicData>
+            </a:graphic>
+          </wp:inline>
+        </w:drawing>
+      </w:r>
+    </w:p>
+    <w:p>
+      <w:pPr>
+        <w:ind w:left="360"/>
+      </w:pPr>
+      <w:r>
         <w:lastRenderedPageBreak/>
-        <w:t xml:space="preserve">Endpoint Get “/config” dùng </w:t>
-      </w:r>
-    </w:p>
-    <w:p>
-      <w:pPr>
-        <w:rPr>
-          <w:b/>
-          <w:bCs/>
-          <w:sz w:val="32"/>
-          <w:szCs w:val="32"/>
-        </w:rPr>
-      </w:pPr>
-    </w:p>
-    <w:p>
-      <w:pPr>
-        <w:ind w:left="360"/>
-        <w:rPr>
-          <w:sz w:val="32"/>
-          <w:szCs w:val="32"/>
-        </w:rPr>
-      </w:pPr>
-    </w:p>
-    <w:p>
-      <w:pPr>
-        <w:rPr>
-          <w:b/>
-          <w:bCs/>
-          <w:sz w:val="32"/>
-          <w:szCs w:val="32"/>
-        </w:rPr>
-      </w:pPr>
-    </w:p>
-    <w:p>
-      <w:pPr>
-        <w:rPr>
-          <w:sz w:val="28"/>
-          <w:szCs w:val="28"/>
+        <w:tab/>
+      </w:r>
+      <w:r>
+        <w:drawing>
+          <wp:inline distT="0" distB="0" distL="0" distR="0" wp14:anchorId="712FABAD" wp14:editId="144E6299">
+            <wp:extent cx="5764647" cy="2495550"/>
+            <wp:effectExtent l="0" t="0" r="7620" b="0"/>
+            <wp:docPr id="1987818082" name="Picture 1"/>
+            <wp:cNvGraphicFramePr>
+              <a:graphicFrameLocks xmlns:a="http://schemas.openxmlformats.org/drawingml/2006/main" noChangeAspect="1"/>
+            </wp:cNvGraphicFramePr>
+            <a:graphic xmlns:a="http://schemas.openxmlformats.org/drawingml/2006/main">
+              <a:graphicData uri="http://schemas.openxmlformats.org/drawingml/2006/picture">
+                <pic:pic xmlns:pic="http://schemas.openxmlformats.org/drawingml/2006/picture">
+                  <pic:nvPicPr>
+                    <pic:cNvPr id="1987818082" name=""/>
+                    <pic:cNvPicPr/>
+                  </pic:nvPicPr>
+                  <pic:blipFill>
+                    <a:blip r:embed="rId23"/>
+                    <a:stretch>
+                      <a:fillRect/>
+                    </a:stretch>
+                  </pic:blipFill>
+                  <pic:spPr>
+                    <a:xfrm>
+                      <a:off x="0" y="0"/>
+                      <a:ext cx="5771748" cy="2498624"/>
+                    </a:xfrm>
+                    <a:prstGeom prst="rect">
+                      <a:avLst/>
+                    </a:prstGeom>
+                  </pic:spPr>
+                </pic:pic>
+              </a:graphicData>
+            </a:graphic>
+          </wp:inline>
+        </w:drawing>
+      </w:r>
+    </w:p>
+    <w:p>
+      <w:pPr>
+        <w:pStyle w:val="ListParagraph"/>
+        <w:numPr>
+          <w:ilvl w:val="0"/>
+          <w:numId w:val="1"/>
+        </w:numPr>
+        <w:rPr>
+          <w:b/>
+          <w:bCs/>
+        </w:rPr>
+      </w:pPr>
+      <w:r>
+        <w:rPr>
+          <w:b/>
+          <w:bCs/>
+        </w:rPr>
+        <w:t>Các endpoints của Product:</w:t>
+      </w:r>
+    </w:p>
+    <w:p>
+      <w:pPr>
+        <w:pStyle w:val="ListParagraph"/>
+      </w:pPr>
+      <w:r>
+        <w:t>+Lấy danh sách các products:</w:t>
+      </w:r>
+    </w:p>
+    <w:p>
+      <w:pPr>
+        <w:pStyle w:val="ListParagraph"/>
+      </w:pPr>
+      <w:r>
+        <w:drawing>
+          <wp:inline distT="0" distB="0" distL="0" distR="0" wp14:anchorId="5A9F6811" wp14:editId="195CA11C">
+            <wp:extent cx="5175250" cy="234434"/>
+            <wp:effectExtent l="0" t="0" r="6350" b="0"/>
+            <wp:docPr id="1559859935" name="Picture 1"/>
+            <wp:cNvGraphicFramePr>
+              <a:graphicFrameLocks xmlns:a="http://schemas.openxmlformats.org/drawingml/2006/main" noChangeAspect="1"/>
+            </wp:cNvGraphicFramePr>
+            <a:graphic xmlns:a="http://schemas.openxmlformats.org/drawingml/2006/main">
+              <a:graphicData uri="http://schemas.openxmlformats.org/drawingml/2006/picture">
+                <pic:pic xmlns:pic="http://schemas.openxmlformats.org/drawingml/2006/picture">
+                  <pic:nvPicPr>
+                    <pic:cNvPr id="1559859935" name=""/>
+                    <pic:cNvPicPr/>
+                  </pic:nvPicPr>
+                  <pic:blipFill>
+                    <a:blip r:embed="rId24"/>
+                    <a:stretch>
+                      <a:fillRect/>
+                    </a:stretch>
+                  </pic:blipFill>
+                  <pic:spPr>
+                    <a:xfrm>
+                      <a:off x="0" y="0"/>
+                      <a:ext cx="5203676" cy="235722"/>
+                    </a:xfrm>
+                    <a:prstGeom prst="rect">
+                      <a:avLst/>
+                    </a:prstGeom>
+                  </pic:spPr>
+                </pic:pic>
+              </a:graphicData>
+            </a:graphic>
+          </wp:inline>
+        </w:drawing>
+      </w:r>
+    </w:p>
+    <w:p>
+      <w:pPr>
+        <w:pStyle w:val="ListParagraph"/>
+      </w:pPr>
+      <w:r>
+        <w:drawing>
+          <wp:inline distT="0" distB="0" distL="0" distR="0" wp14:anchorId="5C0A5F13" wp14:editId="7C4FAD22">
+            <wp:extent cx="5187950" cy="2415501"/>
+            <wp:effectExtent l="0" t="0" r="0" b="4445"/>
+            <wp:docPr id="1576598880" name="Picture 1"/>
+            <wp:cNvGraphicFramePr>
+              <a:graphicFrameLocks xmlns:a="http://schemas.openxmlformats.org/drawingml/2006/main" noChangeAspect="1"/>
+            </wp:cNvGraphicFramePr>
+            <a:graphic xmlns:a="http://schemas.openxmlformats.org/drawingml/2006/main">
+              <a:graphicData uri="http://schemas.openxmlformats.org/drawingml/2006/picture">
+                <pic:pic xmlns:pic="http://schemas.openxmlformats.org/drawingml/2006/picture">
+                  <pic:nvPicPr>
+                    <pic:cNvPr id="1576598880" name=""/>
+                    <pic:cNvPicPr/>
+                  </pic:nvPicPr>
+                  <pic:blipFill>
+                    <a:blip r:embed="rId25"/>
+                    <a:stretch>
+                      <a:fillRect/>
+                    </a:stretch>
+                  </pic:blipFill>
+                  <pic:spPr>
+                    <a:xfrm>
+                      <a:off x="0" y="0"/>
+                      <a:ext cx="5192820" cy="2417769"/>
+                    </a:xfrm>
+                    <a:prstGeom prst="rect">
+                      <a:avLst/>
+                    </a:prstGeom>
+                  </pic:spPr>
+                </pic:pic>
+              </a:graphicData>
+            </a:graphic>
+          </wp:inline>
+        </w:drawing>
+      </w:r>
+    </w:p>
+    <w:p>
+      <w:pPr>
+        <w:pStyle w:val="ListParagraph"/>
+      </w:pPr>
+      <w:r>
+        <w:t>+Lấy danh mục của product dựa vào product_id</w:t>
+      </w:r>
+    </w:p>
+    <w:p>
+      <w:pPr>
+        <w:pStyle w:val="ListParagraph"/>
+      </w:pPr>
+      <w:r>
+        <w:drawing>
+          <wp:inline distT="0" distB="0" distL="0" distR="0" wp14:anchorId="51C5FCEB" wp14:editId="47797F7A">
+            <wp:extent cx="5235290" cy="215900"/>
+            <wp:effectExtent l="0" t="0" r="3810" b="0"/>
+            <wp:docPr id="1029094458" name="Picture 1"/>
+            <wp:cNvGraphicFramePr>
+              <a:graphicFrameLocks xmlns:a="http://schemas.openxmlformats.org/drawingml/2006/main" noChangeAspect="1"/>
+            </wp:cNvGraphicFramePr>
+            <a:graphic xmlns:a="http://schemas.openxmlformats.org/drawingml/2006/main">
+              <a:graphicData uri="http://schemas.openxmlformats.org/drawingml/2006/picture">
+                <pic:pic xmlns:pic="http://schemas.openxmlformats.org/drawingml/2006/picture">
+                  <pic:nvPicPr>
+                    <pic:cNvPr id="1029094458" name=""/>
+                    <pic:cNvPicPr/>
+                  </pic:nvPicPr>
+                  <pic:blipFill>
+                    <a:blip r:embed="rId26"/>
+                    <a:stretch>
+                      <a:fillRect/>
+                    </a:stretch>
+                  </pic:blipFill>
+                  <pic:spPr>
+                    <a:xfrm>
+                      <a:off x="0" y="0"/>
+                      <a:ext cx="5313411" cy="219122"/>
+                    </a:xfrm>
+                    <a:prstGeom prst="rect">
+                      <a:avLst/>
+                    </a:prstGeom>
+                  </pic:spPr>
+                </pic:pic>
+              </a:graphicData>
+            </a:graphic>
+          </wp:inline>
+        </w:drawing>
+      </w:r>
+    </w:p>
+    <w:p>
+      <w:r>
+        <w:tab/>
+      </w:r>
+      <w:r>
+        <w:drawing>
+          <wp:inline distT="0" distB="0" distL="0" distR="0" wp14:anchorId="38411ECE" wp14:editId="14EAF1F9">
+            <wp:extent cx="5277451" cy="2590800"/>
+            <wp:effectExtent l="0" t="0" r="0" b="0"/>
+            <wp:docPr id="1987627917" name="Picture 1"/>
+            <wp:cNvGraphicFramePr>
+              <a:graphicFrameLocks xmlns:a="http://schemas.openxmlformats.org/drawingml/2006/main" noChangeAspect="1"/>
+            </wp:cNvGraphicFramePr>
+            <a:graphic xmlns:a="http://schemas.openxmlformats.org/drawingml/2006/main">
+              <a:graphicData uri="http://schemas.openxmlformats.org/drawingml/2006/picture">
+                <pic:pic xmlns:pic="http://schemas.openxmlformats.org/drawingml/2006/picture">
+                  <pic:nvPicPr>
+                    <pic:cNvPr id="1987627917" name=""/>
+                    <pic:cNvPicPr/>
+                  </pic:nvPicPr>
+                  <pic:blipFill>
+                    <a:blip r:embed="rId27"/>
+                    <a:stretch>
+                      <a:fillRect/>
+                    </a:stretch>
+                  </pic:blipFill>
+                  <pic:spPr>
+                    <a:xfrm>
+                      <a:off x="0" y="0"/>
+                      <a:ext cx="5301573" cy="2602642"/>
+                    </a:xfrm>
+                    <a:prstGeom prst="rect">
+                      <a:avLst/>
+                    </a:prstGeom>
+                  </pic:spPr>
+                </pic:pic>
+              </a:graphicData>
+            </a:graphic>
+          </wp:inline>
+        </w:drawing>
+      </w:r>
+    </w:p>
+    <w:p>
+      <w:r>
+        <w:tab/>
+        <w:t>+Truy xuất tồn kho của Product dựa vào tên của Product</w:t>
+      </w:r>
+    </w:p>
+    <w:p>
+      <w:pPr>
+        <w:ind w:left="720"/>
+      </w:pPr>
+      <w:r>
+        <w:lastRenderedPageBreak/>
+        <w:tab/>
+      </w:r>
+      <w:r>
+        <w:drawing>
+          <wp:inline distT="0" distB="0" distL="0" distR="0" wp14:anchorId="22DBF38F" wp14:editId="735CBB89">
+            <wp:extent cx="5448300" cy="242147"/>
+            <wp:effectExtent l="0" t="0" r="0" b="5715"/>
+            <wp:docPr id="681518072" name="Picture 1"/>
+            <wp:cNvGraphicFramePr>
+              <a:graphicFrameLocks xmlns:a="http://schemas.openxmlformats.org/drawingml/2006/main" noChangeAspect="1"/>
+            </wp:cNvGraphicFramePr>
+            <a:graphic xmlns:a="http://schemas.openxmlformats.org/drawingml/2006/main">
+              <a:graphicData uri="http://schemas.openxmlformats.org/drawingml/2006/picture">
+                <pic:pic xmlns:pic="http://schemas.openxmlformats.org/drawingml/2006/picture">
+                  <pic:nvPicPr>
+                    <pic:cNvPr id="681518072" name=""/>
+                    <pic:cNvPicPr/>
+                  </pic:nvPicPr>
+                  <pic:blipFill>
+                    <a:blip r:embed="rId28"/>
+                    <a:stretch>
+                      <a:fillRect/>
+                    </a:stretch>
+                  </pic:blipFill>
+                  <pic:spPr>
+                    <a:xfrm>
+                      <a:off x="0" y="0"/>
+                      <a:ext cx="5485480" cy="243799"/>
+                    </a:xfrm>
+                    <a:prstGeom prst="rect">
+                      <a:avLst/>
+                    </a:prstGeom>
+                  </pic:spPr>
+                </pic:pic>
+              </a:graphicData>
+            </a:graphic>
+          </wp:inline>
+        </w:drawing>
+      </w:r>
+    </w:p>
+    <w:p>
+      <w:pPr>
+        <w:ind w:firstLine="720"/>
+      </w:pPr>
+      <w:r>
+        <w:drawing>
+          <wp:inline distT="0" distB="0" distL="0" distR="0" wp14:anchorId="3C060264" wp14:editId="31F3EA96">
+            <wp:extent cx="5473700" cy="2792406"/>
+            <wp:effectExtent l="0" t="0" r="0" b="8255"/>
+            <wp:docPr id="630275660" name="Picture 1"/>
+            <wp:cNvGraphicFramePr>
+              <a:graphicFrameLocks xmlns:a="http://schemas.openxmlformats.org/drawingml/2006/main" noChangeAspect="1"/>
+            </wp:cNvGraphicFramePr>
+            <a:graphic xmlns:a="http://schemas.openxmlformats.org/drawingml/2006/main">
+              <a:graphicData uri="http://schemas.openxmlformats.org/drawingml/2006/picture">
+                <pic:pic xmlns:pic="http://schemas.openxmlformats.org/drawingml/2006/picture">
+                  <pic:nvPicPr>
+                    <pic:cNvPr id="630275660" name=""/>
+                    <pic:cNvPicPr/>
+                  </pic:nvPicPr>
+                  <pic:blipFill>
+                    <a:blip r:embed="rId29"/>
+                    <a:stretch>
+                      <a:fillRect/>
+                    </a:stretch>
+                  </pic:blipFill>
+                  <pic:spPr>
+                    <a:xfrm>
+                      <a:off x="0" y="0"/>
+                      <a:ext cx="5477309" cy="2794247"/>
+                    </a:xfrm>
+                    <a:prstGeom prst="rect">
+                      <a:avLst/>
+                    </a:prstGeom>
+                  </pic:spPr>
+                </pic:pic>
+              </a:graphicData>
+            </a:graphic>
+          </wp:inline>
+        </w:drawing>
+      </w:r>
+    </w:p>
+    <w:p>
+      <w:pPr>
+        <w:pStyle w:val="ListParagraph"/>
+        <w:numPr>
+          <w:ilvl w:val="0"/>
+          <w:numId w:val="1"/>
+        </w:numPr>
+        <w:rPr>
+          <w:b/>
+          <w:bCs/>
+        </w:rPr>
+      </w:pPr>
+      <w:r>
+        <w:rPr>
+          <w:b/>
+          <w:bCs/>
+        </w:rPr>
+        <w:t>Endpoint của Category</w:t>
+      </w:r>
+      <w:r>
+        <w:rPr>
+          <w:b/>
+          <w:bCs/>
+        </w:rPr>
+        <w:t>:</w:t>
+      </w:r>
+    </w:p>
+    <w:p>
+      <w:pPr>
+        <w:pStyle w:val="ListParagraph"/>
+      </w:pPr>
+      <w:r>
+        <w:t>Lấy danh sách của category</w:t>
+      </w:r>
+    </w:p>
+    <w:p>
+      <w:pPr>
+        <w:pStyle w:val="ListParagraph"/>
+        <w:rPr>
+          <w:b/>
+          <w:bCs/>
+        </w:rPr>
+      </w:pPr>
+      <w:r>
+        <w:rPr>
+          <w:b/>
+          <w:bCs/>
+        </w:rPr>
+        <w:drawing>
+          <wp:inline distT="0" distB="0" distL="0" distR="0" wp14:anchorId="6DDB599C" wp14:editId="647377DA">
+            <wp:extent cx="5492750" cy="192481"/>
+            <wp:effectExtent l="0" t="0" r="0" b="0"/>
+            <wp:docPr id="1148509531" name="Picture 1"/>
+            <wp:cNvGraphicFramePr>
+              <a:graphicFrameLocks xmlns:a="http://schemas.openxmlformats.org/drawingml/2006/main" noChangeAspect="1"/>
+            </wp:cNvGraphicFramePr>
+            <a:graphic xmlns:a="http://schemas.openxmlformats.org/drawingml/2006/main">
+              <a:graphicData uri="http://schemas.openxmlformats.org/drawingml/2006/picture">
+                <pic:pic xmlns:pic="http://schemas.openxmlformats.org/drawingml/2006/picture">
+                  <pic:nvPicPr>
+                    <pic:cNvPr id="1148509531" name=""/>
+                    <pic:cNvPicPr/>
+                  </pic:nvPicPr>
+                  <pic:blipFill>
+                    <a:blip r:embed="rId30"/>
+                    <a:stretch>
+                      <a:fillRect/>
+                    </a:stretch>
+                  </pic:blipFill>
+                  <pic:spPr>
+                    <a:xfrm>
+                      <a:off x="0" y="0"/>
+                      <a:ext cx="5630722" cy="197316"/>
+                    </a:xfrm>
+                    <a:prstGeom prst="rect">
+                      <a:avLst/>
+                    </a:prstGeom>
+                  </pic:spPr>
+                </pic:pic>
+              </a:graphicData>
+            </a:graphic>
+          </wp:inline>
+        </w:drawing>
+      </w:r>
+    </w:p>
+    <w:p>
+      <w:pPr>
+        <w:pStyle w:val="ListParagraph"/>
+        <w:tabs>
+          <w:tab w:val="left" w:pos="1040"/>
+        </w:tabs>
+        <w:rPr>
+          <w:b/>
+          <w:bCs/>
+        </w:rPr>
+      </w:pPr>
+      <w:r>
+        <w:rPr>
+          <w:b/>
+          <w:bCs/>
+        </w:rPr>
+        <w:drawing>
+          <wp:inline distT="0" distB="0" distL="0" distR="0" wp14:anchorId="73B81DAD" wp14:editId="53F91F49">
+            <wp:extent cx="5511800" cy="2662270"/>
+            <wp:effectExtent l="0" t="0" r="0" b="5080"/>
+            <wp:docPr id="127159475" name="Picture 1"/>
+            <wp:cNvGraphicFramePr>
+              <a:graphicFrameLocks xmlns:a="http://schemas.openxmlformats.org/drawingml/2006/main" noChangeAspect="1"/>
+            </wp:cNvGraphicFramePr>
+            <a:graphic xmlns:a="http://schemas.openxmlformats.org/drawingml/2006/main">
+              <a:graphicData uri="http://schemas.openxmlformats.org/drawingml/2006/picture">
+                <pic:pic xmlns:pic="http://schemas.openxmlformats.org/drawingml/2006/picture">
+                  <pic:nvPicPr>
+                    <pic:cNvPr id="127159475" name=""/>
+                    <pic:cNvPicPr/>
+                  </pic:nvPicPr>
+                  <pic:blipFill>
+                    <a:blip r:embed="rId31"/>
+                    <a:stretch>
+                      <a:fillRect/>
+                    </a:stretch>
+                  </pic:blipFill>
+                  <pic:spPr>
+                    <a:xfrm>
+                      <a:off x="0" y="0"/>
+                      <a:ext cx="5516314" cy="2664450"/>
+                    </a:xfrm>
+                    <a:prstGeom prst="rect">
+                      <a:avLst/>
+                    </a:prstGeom>
+                  </pic:spPr>
+                </pic:pic>
+              </a:graphicData>
+            </a:graphic>
+          </wp:inline>
+        </w:drawing>
+      </w:r>
+    </w:p>
+    <w:p>
+      <w:pPr>
+        <w:pStyle w:val="ListParagraph"/>
+        <w:numPr>
+          <w:ilvl w:val="0"/>
+          <w:numId w:val="1"/>
+        </w:numPr>
+      </w:pPr>
+      <w:r>
+        <w:rPr>
+          <w:b/>
+          <w:bCs/>
+        </w:rPr>
+        <w:t>Các Endpoints của Order:</w:t>
+      </w:r>
+    </w:p>
+    <w:p>
+      <w:pPr>
+        <w:pStyle w:val="ListParagraph"/>
+      </w:pPr>
+      <w:r>
+        <w:t>+ Lấy danh sách các order:</w:t>
+      </w:r>
+    </w:p>
+    <w:p>
+      <w:pPr>
+        <w:pStyle w:val="ListParagraph"/>
+      </w:pPr>
+      <w:r>
+        <w:drawing>
+          <wp:inline distT="0" distB="0" distL="0" distR="0" wp14:anchorId="27DB7E05" wp14:editId="36E9280E">
+            <wp:extent cx="5492750" cy="213607"/>
+            <wp:effectExtent l="0" t="0" r="0" b="0"/>
+            <wp:docPr id="778294543" name="Picture 1"/>
+            <wp:cNvGraphicFramePr>
+              <a:graphicFrameLocks xmlns:a="http://schemas.openxmlformats.org/drawingml/2006/main" noChangeAspect="1"/>
+            </wp:cNvGraphicFramePr>
+            <a:graphic xmlns:a="http://schemas.openxmlformats.org/drawingml/2006/main">
+              <a:graphicData uri="http://schemas.openxmlformats.org/drawingml/2006/picture">
+                <pic:pic xmlns:pic="http://schemas.openxmlformats.org/drawingml/2006/picture">
+                  <pic:nvPicPr>
+                    <pic:cNvPr id="778294543" name=""/>
+                    <pic:cNvPicPr/>
+                  </pic:nvPicPr>
+                  <pic:blipFill>
+                    <a:blip r:embed="rId32"/>
+                    <a:stretch>
+                      <a:fillRect/>
+                    </a:stretch>
+                  </pic:blipFill>
+                  <pic:spPr>
+                    <a:xfrm>
+                      <a:off x="0" y="0"/>
+                      <a:ext cx="5544804" cy="215631"/>
+                    </a:xfrm>
+                    <a:prstGeom prst="rect">
+                      <a:avLst/>
+                    </a:prstGeom>
+                  </pic:spPr>
+                </pic:pic>
+              </a:graphicData>
+            </a:graphic>
+          </wp:inline>
+        </w:drawing>
+      </w:r>
+    </w:p>
+    <w:p>
+      <w:pPr>
+        <w:ind w:left="720"/>
+      </w:pPr>
+      <w:r>
+        <w:lastRenderedPageBreak/>
+        <w:tab/>
+      </w:r>
+      <w:r>
+        <w:drawing>
+          <wp:inline distT="0" distB="0" distL="0" distR="0" wp14:anchorId="2267EC13" wp14:editId="429647EE">
+            <wp:extent cx="5556250" cy="2610132"/>
+            <wp:effectExtent l="0" t="0" r="6350" b="0"/>
+            <wp:docPr id="399740806" name="Picture 1"/>
+            <wp:cNvGraphicFramePr>
+              <a:graphicFrameLocks xmlns:a="http://schemas.openxmlformats.org/drawingml/2006/main" noChangeAspect="1"/>
+            </wp:cNvGraphicFramePr>
+            <a:graphic xmlns:a="http://schemas.openxmlformats.org/drawingml/2006/main">
+              <a:graphicData uri="http://schemas.openxmlformats.org/drawingml/2006/picture">
+                <pic:pic xmlns:pic="http://schemas.openxmlformats.org/drawingml/2006/picture">
+                  <pic:nvPicPr>
+                    <pic:cNvPr id="399740806" name=""/>
+                    <pic:cNvPicPr/>
+                  </pic:nvPicPr>
+                  <pic:blipFill>
+                    <a:blip r:embed="rId33"/>
+                    <a:stretch>
+                      <a:fillRect/>
+                    </a:stretch>
+                  </pic:blipFill>
+                  <pic:spPr>
+                    <a:xfrm>
+                      <a:off x="0" y="0"/>
+                      <a:ext cx="5583722" cy="2623037"/>
+                    </a:xfrm>
+                    <a:prstGeom prst="rect">
+                      <a:avLst/>
+                    </a:prstGeom>
+                  </pic:spPr>
+                </pic:pic>
+              </a:graphicData>
+            </a:graphic>
+          </wp:inline>
+        </w:drawing>
+      </w:r>
+    </w:p>
+    <w:p>
+      <w:pPr>
+        <w:tabs>
+          <w:tab w:val="left" w:pos="690"/>
+          <w:tab w:val="left" w:pos="980"/>
+        </w:tabs>
+        <w:ind w:left="690"/>
+      </w:pPr>
+      <w:r>
+        <w:t>+Truy xuất tổng tiền của đơn hàng dựa vào orderId</w:t>
+      </w:r>
+      <w:r>
+        <w:tab/>
+      </w:r>
+    </w:p>
+    <w:p>
+      <w:pPr>
+        <w:tabs>
+          <w:tab w:val="left" w:pos="690"/>
+          <w:tab w:val="left" w:pos="980"/>
+        </w:tabs>
+        <w:ind w:left="690"/>
+      </w:pPr>
+      <w:r>
+        <w:drawing>
+          <wp:inline distT="0" distB="0" distL="0" distR="0" wp14:anchorId="177F9BE0" wp14:editId="10B078DE">
+            <wp:extent cx="5943600" cy="233680"/>
+            <wp:effectExtent l="0" t="0" r="0" b="0"/>
+            <wp:docPr id="1289011453" name="Picture 1"/>
+            <wp:cNvGraphicFramePr>
+              <a:graphicFrameLocks xmlns:a="http://schemas.openxmlformats.org/drawingml/2006/main" noChangeAspect="1"/>
+            </wp:cNvGraphicFramePr>
+            <a:graphic xmlns:a="http://schemas.openxmlformats.org/drawingml/2006/main">
+              <a:graphicData uri="http://schemas.openxmlformats.org/drawingml/2006/picture">
+                <pic:pic xmlns:pic="http://schemas.openxmlformats.org/drawingml/2006/picture">
+                  <pic:nvPicPr>
+                    <pic:cNvPr id="1289011453" name=""/>
+                    <pic:cNvPicPr/>
+                  </pic:nvPicPr>
+                  <pic:blipFill>
+                    <a:blip r:embed="rId34"/>
+                    <a:stretch>
+                      <a:fillRect/>
+                    </a:stretch>
+                  </pic:blipFill>
+                  <pic:spPr>
+                    <a:xfrm>
+                      <a:off x="0" y="0"/>
+                      <a:ext cx="5943600" cy="233680"/>
+                    </a:xfrm>
+                    <a:prstGeom prst="rect">
+                      <a:avLst/>
+                    </a:prstGeom>
+                  </pic:spPr>
+                </pic:pic>
+              </a:graphicData>
+            </a:graphic>
+          </wp:inline>
+        </w:drawing>
+      </w:r>
+    </w:p>
+    <w:p>
+      <w:pPr>
+        <w:ind w:firstLine="720"/>
+      </w:pPr>
+      <w:r>
+        <w:drawing>
+          <wp:inline distT="0" distB="0" distL="0" distR="0" wp14:anchorId="4A14BE40" wp14:editId="72102F6C">
+            <wp:extent cx="5943600" cy="3056255"/>
+            <wp:effectExtent l="0" t="0" r="0" b="0"/>
+            <wp:docPr id="749757120" name="Picture 1"/>
+            <wp:cNvGraphicFramePr>
+              <a:graphicFrameLocks xmlns:a="http://schemas.openxmlformats.org/drawingml/2006/main" noChangeAspect="1"/>
+            </wp:cNvGraphicFramePr>
+            <a:graphic xmlns:a="http://schemas.openxmlformats.org/drawingml/2006/main">
+              <a:graphicData uri="http://schemas.openxmlformats.org/drawingml/2006/picture">
+                <pic:pic xmlns:pic="http://schemas.openxmlformats.org/drawingml/2006/picture">
+                  <pic:nvPicPr>
+                    <pic:cNvPr id="749757120" name=""/>
+                    <pic:cNvPicPr/>
+                  </pic:nvPicPr>
+                  <pic:blipFill>
+                    <a:blip r:embed="rId35"/>
+                    <a:stretch>
+                      <a:fillRect/>
+                    </a:stretch>
+                  </pic:blipFill>
+                  <pic:spPr>
+                    <a:xfrm>
+                      <a:off x="0" y="0"/>
+                      <a:ext cx="5943600" cy="3056255"/>
+                    </a:xfrm>
+                    <a:prstGeom prst="rect">
+                      <a:avLst/>
+                    </a:prstGeom>
+                  </pic:spPr>
+                </pic:pic>
+              </a:graphicData>
+            </a:graphic>
+          </wp:inline>
+        </w:drawing>
+      </w:r>
+    </w:p>
+    <w:p>
+      <w:pPr>
+        <w:ind w:firstLine="720"/>
+      </w:pPr>
+      <w:r>
+        <w:t>Xem chi tiết source code tại:</w:t>
+      </w:r>
+    </w:p>
+    <w:p>
+      <w:pPr>
+        <w:rPr>
+          <w:b/>
+          <w:bCs/>
+        </w:rPr>
+      </w:pPr>
+      <w:r>
+        <w:rPr>
+          <w:b/>
+          <w:bCs/>
+        </w:rPr>
+        <w:t>Câu 2:</w:t>
+      </w:r>
+    </w:p>
+    <w:p>
+      <w:pPr>
+        <w:pStyle w:val="ListParagraph"/>
+        <w:numPr>
+          <w:ilvl w:val="0"/>
+          <w:numId w:val="2"/>
+        </w:numPr>
+        <w:rPr>
+          <w:highlight w:val="yellow"/>
+        </w:rPr>
+      </w:pPr>
+      <w:r>
+        <w:rPr>
+          <w:highlight w:val="yellow"/>
+        </w:rPr>
+        <w:t xml:space="preserve">Nếu dữ liệu ngày càng nhiều, việc lưu bằng </w:t>
+      </w:r>
+      <w:r>
+        <w:rPr>
+          <w:b/>
+          <w:bCs/>
+          <w:highlight w:val="yellow"/>
+        </w:rPr>
+        <w:t>List hoặc dữ liệu hard-code trong service</w:t>
+      </w:r>
+      <w:r>
+        <w:rPr>
+          <w:highlight w:val="yellow"/>
+        </w:rPr>
+        <w:t xml:space="preserve"> sẽ gặp những hạn chế gì? </w:t>
+      </w:r>
+    </w:p>
+    <w:p>
+      <w:pPr>
+        <w:pStyle w:val="ListParagraph"/>
+      </w:pPr>
+      <w:r>
+        <w:t xml:space="preserve">Nếu dữ liệu ngày càng nhiều (1000 loại giấy khác nhau, 100 mẫu bút khác </w:t>
+      </w:r>
+      <w:proofErr w:type="gramStart"/>
+      <w:r>
+        <w:t>nhau,…</w:t>
+      </w:r>
+      <w:proofErr w:type="gramEnd"/>
+      <w:r>
+        <w:t>), việc lưu bằng List hoặc dữ liệu hard-code trong service sẽ gặp những hạn chế sau:</w:t>
+      </w:r>
+    </w:p>
+    <w:p>
+      <w:pPr>
+        <w:pStyle w:val="ListParagraph"/>
+      </w:pPr>
+      <w:r>
+        <w:t xml:space="preserve">+ Tốn bộ nhớ Ram, vì dữ liệu hardcode hay List sẽ được lưu trên Ram, vì vậy nên khi quá nhiều dữ liệu thì sẽ tốn rất nhiều bộ nhớ Ram, điều này làm ảnh hưởng đến </w:t>
+      </w:r>
+      <w:r>
+        <w:t>hiệu năng của hệ thống và trải nghiệm của người dùng khi dùng chương trình.</w:t>
+      </w:r>
+    </w:p>
+    <w:p>
+      <w:pPr>
+        <w:pStyle w:val="ListParagraph"/>
+      </w:pPr>
+      <w:r>
+        <w:t>+ Dữ liệu sẽ không được lưu trữ khi khởi động chương trình lại, ví dụ cập nhật giá tiền cho cây bút mực thì khi khởi động lại chương trình thì giá tiền vẫn là giá tiền của dữ liệu hardcode chứ không phải dữ liệu mới cập nhật.</w:t>
+      </w:r>
+    </w:p>
+    <w:p>
+      <w:pPr>
+        <w:pStyle w:val="ListParagraph"/>
+        <w:numPr>
+          <w:ilvl w:val="0"/>
+          <w:numId w:val="2"/>
+        </w:numPr>
+        <w:rPr>
+          <w:highlight w:val="yellow"/>
+        </w:rPr>
+      </w:pPr>
+      <w:r>
+        <w:rPr>
+          <w:highlight w:val="yellow"/>
+        </w:rPr>
+        <w:lastRenderedPageBreak/>
+        <w:t>Nếu có nhiều người cùng sử dụng hệ thống, chương trình hiện tại còn thiếu những chức năng nào để dùng được trong thực tế? </w:t>
+      </w:r>
+    </w:p>
+    <w:p>
+      <w:pPr>
+        <w:pStyle w:val="ListParagraph"/>
+      </w:pPr>
+      <w:r>
+        <w:t>Để có nhiều người cùng sử dụng hệ thống, chương trình hiện tại cần:</w:t>
+      </w:r>
+    </w:p>
+    <w:p>
+      <w:pPr>
+        <w:pStyle w:val="ListParagraph"/>
+      </w:pPr>
+      <w:r>
+        <w:t xml:space="preserve">+ Thêm các thao tác Create, Update, </w:t>
+      </w:r>
+      <w:proofErr w:type="gramStart"/>
+      <w:r>
+        <w:t>Delete</w:t>
+      </w:r>
+      <w:proofErr w:type="gramEnd"/>
+      <w:r>
+        <w:t xml:space="preserve"> vì hiện tại chỉ có phương thức Get.</w:t>
+      </w:r>
+    </w:p>
+    <w:p>
+      <w:pPr>
+        <w:pStyle w:val="ListParagraph"/>
+      </w:pPr>
+      <w:r>
+        <w:t>+ Xác thực và phân quyền người dùng: hiện tại ai cũng có thể truy cập các endpoints, nhưng thực tế chỉ nhân viên bán hàng hoặc chủ cửa hàng thì mới được sửa hay cập nhật mặt hàng hoặc tồn kho. Khách hàng chỉ được xem thôi. Và điều này cũng hạn chế lượng truy cập cùng lúc vào cùng 1 endpoint quá tải nữa.</w:t>
+      </w:r>
+    </w:p>
+    <w:p>
+      <w:pPr>
+        <w:pStyle w:val="ListParagraph"/>
+        <w:numPr>
+          <w:ilvl w:val="0"/>
+          <w:numId w:val="2"/>
+        </w:numPr>
+        <w:rPr>
+          <w:highlight w:val="yellow"/>
+        </w:rPr>
+      </w:pPr>
+      <w:r>
+        <w:rPr>
+          <w:highlight w:val="yellow"/>
+        </w:rPr>
+        <w:t>Nếu muốn giảm sai sót khi nhập dữ liệu hoặc trả sai trạng thái, em sẽ cải tiến phần validation, service logic, routing, middleware hoặc configuration như thế nào? </w:t>
+      </w:r>
+    </w:p>
+    <w:p>
+      <w:pPr>
+        <w:pStyle w:val="NormalWeb"/>
+        <w:ind w:left="720"/>
+      </w:pPr>
+      <w:r>
+        <w:rPr>
+          <w:b/>
+          <w:bCs/>
+        </w:rPr>
+        <w:t xml:space="preserve">+ </w:t>
+      </w:r>
+      <w:r>
+        <w:rPr>
+          <w:b/>
+          <w:bCs/>
+        </w:rPr>
+        <w:t>Validation:</w:t>
+      </w:r>
+      <w:r>
+        <w:t xml:space="preserve"> Sử dụng </w:t>
+      </w:r>
+      <w:r>
+        <w:rPr>
+          <w:b/>
+          <w:bCs/>
+        </w:rPr>
+        <w:t>Data Annotations</w:t>
+      </w:r>
+      <w:r>
+        <w:t xml:space="preserve"> để ngăn chặn các lỗi nhập liệu như tên trống hoặc giá tiền </w:t>
+      </w:r>
+      <w:r>
+        <w:t xml:space="preserve">hay số lượng tồn kho </w:t>
+      </w:r>
+      <w:r>
+        <w:t>âm.</w:t>
+      </w:r>
+    </w:p>
+    <w:p>
+      <w:pPr>
+        <w:pStyle w:val="NormalWeb"/>
+        <w:ind w:left="720"/>
+      </w:pPr>
+      <w:r>
+        <w:rPr>
+          <w:b/>
+          <w:bCs/>
+        </w:rPr>
+        <w:t xml:space="preserve">+ </w:t>
+      </w:r>
+      <w:r>
+        <w:rPr>
+          <w:b/>
+          <w:bCs/>
+        </w:rPr>
+        <w:t>Service Logic:</w:t>
+      </w:r>
+      <w:r>
+        <w:t xml:space="preserve"> kiểm tra nghiệp vụ tầng Service. Ví dụ: Trước khi trừ kho, Service phải kiểm tra xem</w:t>
+      </w:r>
+      <w:r>
+        <w:t xml:space="preserve"> số lượng tồn kho</w:t>
+      </w:r>
+      <w:r>
+        <w:t xml:space="preserve"> có đủ cung cấp cho đơn hàng hay không.</w:t>
+      </w:r>
+    </w:p>
+    <w:p>
+      <w:pPr>
+        <w:pStyle w:val="NormalWeb"/>
+        <w:ind w:left="720"/>
+      </w:pPr>
+      <w:r>
+        <w:rPr>
+          <w:b/>
+          <w:bCs/>
+        </w:rPr>
+        <w:t>Middleware:</w:t>
+      </w:r>
+      <w:r>
+        <w:t xml:space="preserve"> Cài đặt một </w:t>
+      </w:r>
+      <w:r>
+        <w:rPr>
+          <w:b/>
+          <w:bCs/>
+        </w:rPr>
+        <w:t>Global Exception Handler</w:t>
+      </w:r>
+      <w:r>
+        <w:t xml:space="preserve"> để bắt lỗi tập</w:t>
+      </w:r>
+      <w:r>
+        <w:t xml:space="preserve"> trung, vì nếu như dự án có hàng chục hay hàng trăm file, và có những exception giống nhau được sử dụng ở nhiều file thì nếu muốn thay đổi hay chỉnh sửa exception thì phải chỉnh hết 1 hoặc 100 hay 1000 exceptions, nên </w:t>
+      </w:r>
+      <w:r>
+        <w:rPr>
+          <w:b/>
+          <w:bCs/>
+        </w:rPr>
+        <w:t>Global Exception Handler</w:t>
+      </w:r>
+      <w:r>
+        <w:t xml:space="preserve"> sẽ giúp giải quyết được việc này.</w:t>
+      </w:r>
+      <w:r>
+        <w:t xml:space="preserve"> </w:t>
+      </w:r>
+    </w:p>
+    <w:p>
+      <w:pPr>
+        <w:pStyle w:val="NormalWeb"/>
+        <w:numPr>
+          <w:ilvl w:val="0"/>
+          <w:numId w:val="2"/>
+        </w:numPr>
+        <w:rPr>
+          <w:highlight w:val="yellow"/>
+        </w:rPr>
+      </w:pPr>
+      <w:r>
+        <w:rPr>
+          <w:highlight w:val="yellow"/>
+        </w:rPr>
+        <w:t>Nếu cần phát triển ứng dụng này thành một hệ thống thật ở các tuần sau, theo em nên ưu tiên mở rộng phần nào trước: CRUD, tìm kiếm, phân trang, authentication/authorization, hay kết nối database? Hãy giải thích lý do. </w:t>
+      </w:r>
+    </w:p>
+    <w:p>
+      <w:pPr>
+        <w:pStyle w:val="NormalWeb"/>
+        <w:ind w:left="720"/>
+      </w:pPr>
+      <w:r>
+        <w:t>Em ưu tiên</w:t>
+      </w:r>
+      <w:r>
+        <w:t xml:space="preserve"> </w:t>
+      </w:r>
+      <w:r>
+        <w:rPr>
+          <w:b/>
+          <w:bCs/>
+        </w:rPr>
+        <w:t>k</w:t>
+      </w:r>
+      <w:r>
+        <w:rPr>
+          <w:b/>
+          <w:bCs/>
+        </w:rPr>
+        <w:t xml:space="preserve">ết nối Database </w:t>
+      </w:r>
+      <w:r>
+        <w:t>vì những mặt hạn chế ở câu 1. Nếu không</w:t>
+      </w:r>
+      <w:r>
+        <w:t xml:space="preserve"> có Database</w:t>
+      </w:r>
+      <w:r>
+        <w:t>, thì việc CRUD, tìm kiếm, phân trang… cũng vô nghĩa, vì dữ liệu đều mất sạch khi chạy lại chương trình.</w:t>
+      </w:r>
+    </w:p>
+    <w:p>
+      <w:pPr>
+        <w:pStyle w:val="NormalWeb"/>
+        <w:numPr>
+          <w:ilvl w:val="0"/>
+          <w:numId w:val="2"/>
+        </w:numPr>
+        <w:rPr>
+          <w:highlight w:val="yellow"/>
+        </w:rPr>
+      </w:pPr>
+      <w:r>
+        <w:rPr>
+          <w:highlight w:val="yellow"/>
+        </w:rPr>
+        <w:t>Theo em, trong bài toán em chọn, đâu là vấn đề nghiệp vụ quan trọng nhất mà hệ thống cần giải quyết tốt để có ích trong thực tế? </w:t>
+      </w:r>
+    </w:p>
+    <w:p>
+      <w:pPr>
+        <w:pStyle w:val="NormalWeb"/>
+        <w:ind w:left="720"/>
+      </w:pPr>
+      <w:r>
+        <w:t>Th</w:t>
+      </w:r>
+      <w:r>
+        <w:t>eo em, vấn đề nghiệp vụ quan trọng nhất mà hệ thống cửa hàng văn phòng phẩm cần quản lý là quản lý tồn kho và cảnh báo số lượng tồn kho thấp. Mục đích để ngăn chặn nếu người dùng đang cần mua hàng nhưng lại không có hàng. Vì điều này sẽ gây mất lòng khách hàng và dẫn đến sự suy giảm khách hàng đối với cửa hàng, cũng làm giảm luôn doanh thu.</w:t>
+      </w:r>
+    </w:p>
+    <w:p>
+      <w:pPr>
+        <w:pStyle w:val="ListParagraph"/>
+        <w:numPr>
+          <w:ilvl w:val="0"/>
+          <w:numId w:val="2"/>
+        </w:numPr>
+        <w:rPr>
+          <w:highlight w:val="yellow"/>
+        </w:rPr>
+      </w:pPr>
+      <w:r>
+        <w:rPr>
+          <w:highlight w:val="yellow"/>
+        </w:rPr>
+        <w:t>Nếu ứng dụng chạy đúng ở local nhưng lên máy khác hoặc môi trường khác thì lỗi, em sẽ kiểm tra theo thứ tự nào giữa: </w:t>
+      </w:r>
+    </w:p>
+    <w:p>
+      <w:pPr>
+        <w:pStyle w:val="ListParagraph"/>
+      </w:pPr>
+      <w:r>
+        <w:t>environment </w:t>
+      </w:r>
+    </w:p>
+    <w:p>
+      <w:pPr>
+        <w:pStyle w:val="ListParagraph"/>
+      </w:pPr>
+      <w:proofErr w:type="gramStart"/>
+      <w:r>
+        <w:t>appsettings.json</w:t>
+      </w:r>
+      <w:proofErr w:type="gramEnd"/>
+      <w:r>
+        <w:t> </w:t>
+      </w:r>
+    </w:p>
+    <w:p>
+      <w:pPr>
+        <w:pStyle w:val="ListParagraph"/>
+      </w:pPr>
+      <w:proofErr w:type="gramStart"/>
+      <w:r>
+        <w:t>appsettings.Development.json</w:t>
+      </w:r>
+      <w:proofErr w:type="gramEnd"/>
+      <w:r>
+        <w:t> </w:t>
+      </w:r>
+    </w:p>
+    <w:p>
+      <w:pPr>
+        <w:pStyle w:val="ListParagraph"/>
+      </w:pPr>
+      <w:r>
+        <w:t>launch profile </w:t>
+      </w:r>
+    </w:p>
+    <w:p>
+      <w:pPr>
+        <w:pStyle w:val="ListParagraph"/>
+      </w:pPr>
+      <w:proofErr w:type="gramStart"/>
+      <w:r>
+        <w:t>middleware</w:t>
+      </w:r>
+      <w:proofErr w:type="gramEnd"/>
+      <w:r>
+        <w:t xml:space="preserve"> pipeline </w:t>
+      </w:r>
+    </w:p>
+    <w:p>
+      <w:pPr>
+        <w:pStyle w:val="ListParagraph"/>
+        <w:rPr>
+          <w:b/>
+          <w:bCs/>
+        </w:rPr>
+      </w:pPr>
+      <w:r>
+        <w:t>route mapping</w:t>
+      </w:r>
+      <w:r>
+        <w:rPr>
+          <w:b/>
+          <w:bCs/>
+        </w:rPr>
+        <w:t> </w:t>
+      </w:r>
+    </w:p>
+    <w:p>
+      <w:pPr>
+        <w:pStyle w:val="ListParagraph"/>
+      </w:pPr>
+      <w:r>
+        <w:rPr>
+          <w:b/>
+          <w:bCs/>
+        </w:rPr>
+        <w:t xml:space="preserve">Đầu tiên, </w:t>
+      </w:r>
+      <w:r>
+        <w:t xml:space="preserve">em sẽ kiểm tra </w:t>
+      </w:r>
+      <w:proofErr w:type="gramStart"/>
+      <w:r>
+        <w:t>launch.json</w:t>
+      </w:r>
+      <w:proofErr w:type="gramEnd"/>
+      <w:r>
+        <w:t xml:space="preserve"> vì file này là nơi cấu hình cổng port hay giao thức (Http/Https). Ví dụ: k</w:t>
+      </w:r>
+      <w:r>
+        <w:t xml:space="preserve">iểm tra cổng (Port) có bị trùng với ứng dụng khác trên máy mới không. </w:t>
+      </w:r>
+      <w:r>
+        <w:t>Nếu trùng thì sẽ gây ra lỗi khiến ứng dụng không thể khởi động.</w:t>
+      </w:r>
+    </w:p>
+    <w:p>
+      <w:pPr>
+        <w:pStyle w:val="ListParagraph"/>
+      </w:pPr>
+      <w:r>
+        <w:rPr>
+          <w:b/>
+          <w:bCs/>
+        </w:rPr>
+        <w:lastRenderedPageBreak/>
+        <w:t xml:space="preserve">Thứ 2, </w:t>
+      </w:r>
+      <w:r>
+        <w:t>tiếp theo kiểm tra environment bằng cách x</w:t>
+      </w:r>
+      <w:r>
+        <w:t xml:space="preserve">ác nhận biến môi trường </w:t>
+      </w:r>
+      <w:r>
+        <w:t>A</w:t>
+      </w:r>
+      <w:r>
+        <w:t>SPNETCORE_ENVIRONMENT</w:t>
+      </w:r>
+      <w:r>
+        <w:t xml:space="preserve"> </w:t>
+      </w:r>
+      <w:r>
+        <w:t>đã được đặt là Development chưa</w:t>
+      </w:r>
+      <w:r>
+        <w:t xml:space="preserve">. Vì nếu </w:t>
+      </w:r>
+      <w:r>
+        <w:t>không phải development thì</w:t>
+      </w:r>
+      <w:r>
+        <w:t xml:space="preserve"> </w:t>
+      </w:r>
+      <w:r>
+        <w:rPr>
+          <w:b/>
+          <w:bCs/>
+        </w:rPr>
+        <w:t>Swagger</w:t>
+      </w:r>
+      <w:r>
+        <w:t xml:space="preserve"> sẽ bị tắt theo mặc định trong Program.cs. Nếu không bật đúng môi trường, </w:t>
+      </w:r>
+      <w:r>
+        <w:t>ta</w:t>
+      </w:r>
+      <w:r>
+        <w:t xml:space="preserve"> sẽ thấy trang trắng hoặc lỗi</w:t>
+      </w:r>
+      <w:r>
+        <w:t>.</w:t>
+      </w:r>
+    </w:p>
+    <w:p>
+      <w:pPr>
+        <w:pStyle w:val="ListParagraph"/>
+      </w:pPr>
+      <w:r>
+        <w:rPr>
+          <w:b/>
+          <w:bCs/>
+        </w:rPr>
+        <w:t xml:space="preserve">Thứ 3, </w:t>
+      </w:r>
+      <w:r>
+        <w:t xml:space="preserve">kiểm tra file </w:t>
+      </w:r>
+      <w:proofErr w:type="gramStart"/>
+      <w:r>
+        <w:t>appsettings.Development.json</w:t>
+      </w:r>
+      <w:proofErr w:type="gramEnd"/>
+      <w:r>
+        <w:t xml:space="preserve"> có bị thiếu hay sai ở đâu không? </w:t>
+      </w:r>
+      <w:r>
+        <w:t xml:space="preserve">Nếu thiếu file này, các cấu hình riêng cho môi trường Dev sẽ bị mất, khiến các Service không </w:t>
+      </w:r>
+    </w:p>
+    <w:p>
+      <w:pPr>
+        <w:pStyle w:val="ListParagraph"/>
+      </w:pPr>
+      <w:r>
+        <w:rPr>
+          <w:b/>
+          <w:bCs/>
+        </w:rPr>
+        <w:t xml:space="preserve">Thứ 4, </w:t>
+      </w:r>
+      <w:r>
+        <w:t>khởi tạo được dữ liệu mẫu cho cửa hàng văn phòng phẩm.</w:t>
+      </w:r>
+    </w:p>
+    <w:p>
+      <w:pPr>
+        <w:pStyle w:val="ListParagraph"/>
+      </w:pPr>
+      <w:r>
+        <w:t>kiểm tra middleware pipeline, k</w:t>
+      </w:r>
+      <w:r>
+        <w:t>iểm tra xem các cấu hình bảo mật (CORS, HTTPS) có đang chặn request từ môi trường mới không.</w:t>
+      </w:r>
+      <w:r>
+        <w:t xml:space="preserve"> Vì có thể app chạy nhưng báo lỗi 403 (Not found), 404 (bad request</w:t>
+      </w:r>
+      <w:proofErr w:type="gramStart"/>
+      <w:r>
+        <w:t>),,</w:t>
+      </w:r>
+      <w:proofErr w:type="gramEnd"/>
+      <w:r>
+        <w:t>…</w:t>
+      </w:r>
+    </w:p>
+    <w:p>
+      <w:pPr>
+        <w:pStyle w:val="ListParagraph"/>
+      </w:pPr>
+      <w:r>
+        <w:rPr>
+          <w:b/>
+          <w:bCs/>
+        </w:rPr>
+        <w:t>Thứ 5,</w:t>
+      </w:r>
+      <w:r>
+        <w:rPr>
+          <w:b/>
+          <w:bCs/>
+        </w:rPr>
+        <w:t xml:space="preserve"> </w:t>
+      </w:r>
+      <w:r>
+        <w:t>kiểm tra route mapping vì nếu chạy trên môi trường môi trường production thì route của nó có khi sẽ thay đổi. Ví dụ ở local là api/v1/products còn productions là /products.</w:t>
+      </w:r>
+      <w:r>
+        <w:rPr>
+          <w:b/>
+          <w:bCs/>
+        </w:rPr>
+        <w:t xml:space="preserve"> </w:t>
+      </w:r>
+    </w:p>
+    <w:p>
+      <w:pPr>
+        <w:pStyle w:val="ListParagraph"/>
+      </w:pPr>
+      <w:r>
+        <w:rPr>
+          <w:b/>
+          <w:bCs/>
+        </w:rPr>
+        <w:t xml:space="preserve">Cuối cùng, </w:t>
+      </w:r>
+      <w:r>
+        <w:t>k</w:t>
+      </w:r>
+      <w:r>
+        <w:t>iểm tra</w:t>
+      </w:r>
+      <w:r>
+        <w:t xml:space="preserve"> file </w:t>
+      </w:r>
+      <w:proofErr w:type="gramStart"/>
+      <w:r>
+        <w:t>appsettings.json</w:t>
+      </w:r>
+      <w:proofErr w:type="gramEnd"/>
+      <w:r>
+        <w:t>. Kiểm tra</w:t>
+      </w:r>
+      <w:r>
+        <w:t xml:space="preserve"> thông số cấu hình chung của hệ thống.</w:t>
+      </w:r>
+      <w:r>
+        <w:t xml:space="preserve"> Ví dụ endpoint /config cho chúng ta thông tin sai về applicationName hay version…</w:t>
+      </w:r>
+    </w:p>
+    <w:p>
+      <w:pPr>
+        <w:pStyle w:val="ListParagraph"/>
+        <w:rPr>
+          <w:b/>
+          <w:bCs/>
         </w:rPr>
       </w:pPr>
     </w:p>
@@ -1644,7 +2781,98 @@
   <w:abstractNum w:abstractNumId="0" w15:restartNumberingAfterBreak="0">
     <w:nsid w:val="1AEE5BD8"/>
     <w:multiLevelType w:val="hybridMultilevel"/>
-    <w:tmpl w:val="1E62E136"/>
+    <w:tmpl w:val="4CD26DFA"/>
+    <w:lvl w:ilvl="0" w:tplc="88A8276A">
+      <w:start w:val="1"/>
+      <w:numFmt w:val="decimal"/>
+      <w:lvlText w:val="%1."/>
+      <w:lvlJc w:val="left"/>
+      <w:pPr>
+        <w:ind w:left="720" w:hanging="360"/>
+      </w:pPr>
+      <w:rPr>
+        <w:rFonts w:hint="default"/>
+        <w:b/>
+        <w:bCs/>
+      </w:rPr>
+    </w:lvl>
+    <w:lvl w:ilvl="1" w:tplc="04090019" w:tentative="1">
+      <w:start w:val="1"/>
+      <w:numFmt w:val="lowerLetter"/>
+      <w:lvlText w:val="%2."/>
+      <w:lvlJc w:val="left"/>
+      <w:pPr>
+        <w:ind w:left="1440" w:hanging="360"/>
+      </w:pPr>
+    </w:lvl>
+    <w:lvl w:ilvl="2" w:tplc="0409001B" w:tentative="1">
+      <w:start w:val="1"/>
+      <w:numFmt w:val="lowerRoman"/>
+      <w:lvlText w:val="%3."/>
+      <w:lvlJc w:val="right"/>
+      <w:pPr>
+        <w:ind w:left="2160" w:hanging="180"/>
+      </w:pPr>
+    </w:lvl>
+    <w:lvl w:ilvl="3" w:tplc="0409000F" w:tentative="1">
+      <w:start w:val="1"/>
+      <w:numFmt w:val="decimal"/>
+      <w:lvlText w:val="%4."/>
+      <w:lvlJc w:val="left"/>
+      <w:pPr>
+        <w:ind w:left="2880" w:hanging="360"/>
+      </w:pPr>
+    </w:lvl>
+    <w:lvl w:ilvl="4" w:tplc="04090019" w:tentative="1">
+      <w:start w:val="1"/>
+      <w:numFmt w:val="lowerLetter"/>
+      <w:lvlText w:val="%5."/>
+      <w:lvlJc w:val="left"/>
+      <w:pPr>
+        <w:ind w:left="3600" w:hanging="360"/>
+      </w:pPr>
+    </w:lvl>
+    <w:lvl w:ilvl="5" w:tplc="0409001B" w:tentative="1">
+      <w:start w:val="1"/>
+      <w:numFmt w:val="lowerRoman"/>
+      <w:lvlText w:val="%6."/>
+      <w:lvlJc w:val="right"/>
+      <w:pPr>
+        <w:ind w:left="4320" w:hanging="180"/>
+      </w:pPr>
+    </w:lvl>
+    <w:lvl w:ilvl="6" w:tplc="0409000F" w:tentative="1">
+      <w:start w:val="1"/>
+      <w:numFmt w:val="decimal"/>
+      <w:lvlText w:val="%7."/>
+      <w:lvlJc w:val="left"/>
+      <w:pPr>
+        <w:ind w:left="5040" w:hanging="360"/>
+      </w:pPr>
+    </w:lvl>
+    <w:lvl w:ilvl="7" w:tplc="04090019" w:tentative="1">
+      <w:start w:val="1"/>
+      <w:numFmt w:val="lowerLetter"/>
+      <w:lvlText w:val="%8."/>
+      <w:lvlJc w:val="left"/>
+      <w:pPr>
+        <w:ind w:left="5760" w:hanging="360"/>
+      </w:pPr>
+    </w:lvl>
+    <w:lvl w:ilvl="8" w:tplc="0409001B" w:tentative="1">
+      <w:start w:val="1"/>
+      <w:numFmt w:val="lowerRoman"/>
+      <w:lvlText w:val="%9."/>
+      <w:lvlJc w:val="right"/>
+      <w:pPr>
+        <w:ind w:left="6480" w:hanging="180"/>
+      </w:pPr>
+    </w:lvl>
+  </w:abstractNum>
+  <w:abstractNum w:abstractNumId="1" w15:restartNumberingAfterBreak="0">
+    <w:nsid w:val="4D7546C8"/>
+    <w:multiLevelType w:val="hybridMultilevel"/>
+    <w:tmpl w:val="477A6E86"/>
     <w:lvl w:ilvl="0" w:tplc="0409000F">
       <w:start w:val="1"/>
       <w:numFmt w:val="decimal"/>
@@ -1730,8 +2958,251 @@
       </w:pPr>
     </w:lvl>
   </w:abstractNum>
+  <w:abstractNum w:abstractNumId="2" w15:restartNumberingAfterBreak="0">
+    <w:nsid w:val="7BA54D95"/>
+    <w:multiLevelType w:val="multilevel"/>
+    <w:tmpl w:val="4490B5E6"/>
+    <w:lvl w:ilvl="0">
+      <w:start w:val="1"/>
+      <w:numFmt w:val="decimal"/>
+      <w:lvlText w:val="%1."/>
+      <w:lvlJc w:val="left"/>
+      <w:pPr>
+        <w:tabs>
+          <w:tab w:val="num" w:pos="720"/>
+        </w:tabs>
+        <w:ind w:left="720" w:hanging="360"/>
+      </w:pPr>
+    </w:lvl>
+    <w:lvl w:ilvl="1">
+      <w:start w:val="1"/>
+      <w:numFmt w:val="bullet"/>
+      <w:lvlText w:val="o"/>
+      <w:lvlJc w:val="left"/>
+      <w:pPr>
+        <w:tabs>
+          <w:tab w:val="num" w:pos="1440"/>
+        </w:tabs>
+        <w:ind w:left="1440" w:hanging="360"/>
+      </w:pPr>
+      <w:rPr>
+        <w:rFonts w:ascii="Courier New" w:hAnsi="Courier New" w:hint="default"/>
+        <w:sz w:val="20"/>
+      </w:rPr>
+    </w:lvl>
+    <w:lvl w:ilvl="2" w:tentative="1">
+      <w:start w:val="1"/>
+      <w:numFmt w:val="decimal"/>
+      <w:lvlText w:val="%3."/>
+      <w:lvlJc w:val="left"/>
+      <w:pPr>
+        <w:tabs>
+          <w:tab w:val="num" w:pos="2160"/>
+        </w:tabs>
+        <w:ind w:left="2160" w:hanging="360"/>
+      </w:pPr>
+    </w:lvl>
+    <w:lvl w:ilvl="3" w:tentative="1">
+      <w:start w:val="1"/>
+      <w:numFmt w:val="decimal"/>
+      <w:lvlText w:val="%4."/>
+      <w:lvlJc w:val="left"/>
+      <w:pPr>
+        <w:tabs>
+          <w:tab w:val="num" w:pos="2880"/>
+        </w:tabs>
+        <w:ind w:left="2880" w:hanging="360"/>
+      </w:pPr>
+    </w:lvl>
+    <w:lvl w:ilvl="4" w:tentative="1">
+      <w:start w:val="1"/>
+      <w:numFmt w:val="decimal"/>
+      <w:lvlText w:val="%5."/>
+      <w:lvlJc w:val="left"/>
+      <w:pPr>
+        <w:tabs>
+          <w:tab w:val="num" w:pos="3600"/>
+        </w:tabs>
+        <w:ind w:left="3600" w:hanging="360"/>
+      </w:pPr>
+    </w:lvl>
+    <w:lvl w:ilvl="5" w:tentative="1">
+      <w:start w:val="1"/>
+      <w:numFmt w:val="decimal"/>
+      <w:lvlText w:val="%6."/>
+      <w:lvlJc w:val="left"/>
+      <w:pPr>
+        <w:tabs>
+          <w:tab w:val="num" w:pos="4320"/>
+        </w:tabs>
+        <w:ind w:left="4320" w:hanging="360"/>
+      </w:pPr>
+    </w:lvl>
+    <w:lvl w:ilvl="6" w:tentative="1">
+      <w:start w:val="1"/>
+      <w:numFmt w:val="decimal"/>
+      <w:lvlText w:val="%7."/>
+      <w:lvlJc w:val="left"/>
+      <w:pPr>
+        <w:tabs>
+          <w:tab w:val="num" w:pos="5040"/>
+        </w:tabs>
+        <w:ind w:left="5040" w:hanging="360"/>
+      </w:pPr>
+    </w:lvl>
+    <w:lvl w:ilvl="7" w:tentative="1">
+      <w:start w:val="1"/>
+      <w:numFmt w:val="decimal"/>
+      <w:lvlText w:val="%8."/>
+      <w:lvlJc w:val="left"/>
+      <w:pPr>
+        <w:tabs>
+          <w:tab w:val="num" w:pos="5760"/>
+        </w:tabs>
+        <w:ind w:left="5760" w:hanging="360"/>
+      </w:pPr>
+    </w:lvl>
+    <w:lvl w:ilvl="8" w:tentative="1">
+      <w:start w:val="1"/>
+      <w:numFmt w:val="decimal"/>
+      <w:lvlText w:val="%9."/>
+      <w:lvlJc w:val="left"/>
+      <w:pPr>
+        <w:tabs>
+          <w:tab w:val="num" w:pos="6480"/>
+        </w:tabs>
+        <w:ind w:left="6480" w:hanging="360"/>
+      </w:pPr>
+    </w:lvl>
+  </w:abstractNum>
   <w:num w:numId="1" w16cid:durableId="1393309939">
     <w:abstractNumId w:val="0"/>
+  </w:num>
+  <w:num w:numId="2" w16cid:durableId="173497627">
+    <w:abstractNumId w:val="1"/>
+  </w:num>
+  <w:num w:numId="3" w16cid:durableId="1674917297">
+    <w:abstractNumId w:val="2"/>
+  </w:num>
+  <w:num w:numId="4" w16cid:durableId="1544906696">
+    <w:abstractNumId w:val="2"/>
+    <w:lvlOverride w:ilvl="1">
+      <w:lvl w:ilvl="1">
+        <w:numFmt w:val="bullet"/>
+        <w:lvlText w:val=""/>
+        <w:lvlJc w:val="left"/>
+        <w:pPr>
+          <w:tabs>
+            <w:tab w:val="num" w:pos="1440"/>
+          </w:tabs>
+          <w:ind w:left="1440" w:hanging="360"/>
+        </w:pPr>
+        <w:rPr>
+          <w:rFonts w:ascii="Symbol" w:hAnsi="Symbol" w:hint="default"/>
+          <w:sz w:val="20"/>
+        </w:rPr>
+      </w:lvl>
+    </w:lvlOverride>
+  </w:num>
+  <w:num w:numId="5" w16cid:durableId="1425422482">
+    <w:abstractNumId w:val="2"/>
+    <w:lvlOverride w:ilvl="1">
+      <w:lvl w:ilvl="1">
+        <w:numFmt w:val="bullet"/>
+        <w:lvlText w:val=""/>
+        <w:lvlJc w:val="left"/>
+        <w:pPr>
+          <w:tabs>
+            <w:tab w:val="num" w:pos="1440"/>
+          </w:tabs>
+          <w:ind w:left="1440" w:hanging="360"/>
+        </w:pPr>
+        <w:rPr>
+          <w:rFonts w:ascii="Symbol" w:hAnsi="Symbol" w:hint="default"/>
+          <w:sz w:val="20"/>
+        </w:rPr>
+      </w:lvl>
+    </w:lvlOverride>
+  </w:num>
+  <w:num w:numId="6" w16cid:durableId="2141878447">
+    <w:abstractNumId w:val="2"/>
+    <w:lvlOverride w:ilvl="1">
+      <w:lvl w:ilvl="1">
+        <w:numFmt w:val="bullet"/>
+        <w:lvlText w:val=""/>
+        <w:lvlJc w:val="left"/>
+        <w:pPr>
+          <w:tabs>
+            <w:tab w:val="num" w:pos="1440"/>
+          </w:tabs>
+          <w:ind w:left="1440" w:hanging="360"/>
+        </w:pPr>
+        <w:rPr>
+          <w:rFonts w:ascii="Symbol" w:hAnsi="Symbol" w:hint="default"/>
+          <w:sz w:val="20"/>
+        </w:rPr>
+      </w:lvl>
+    </w:lvlOverride>
+  </w:num>
+  <w:num w:numId="7" w16cid:durableId="1765344936">
+    <w:abstractNumId w:val="2"/>
+    <w:lvlOverride w:ilvl="1">
+      <w:lvl w:ilvl="1">
+        <w:numFmt w:val="bullet"/>
+        <w:lvlText w:val=""/>
+        <w:lvlJc w:val="left"/>
+        <w:pPr>
+          <w:tabs>
+            <w:tab w:val="num" w:pos="1440"/>
+          </w:tabs>
+          <w:ind w:left="1440" w:hanging="360"/>
+        </w:pPr>
+        <w:rPr>
+          <w:rFonts w:ascii="Symbol" w:hAnsi="Symbol" w:hint="default"/>
+          <w:sz w:val="20"/>
+        </w:rPr>
+      </w:lvl>
+    </w:lvlOverride>
+  </w:num>
+  <w:num w:numId="8" w16cid:durableId="2134904734">
+    <w:abstractNumId w:val="2"/>
+    <w:lvlOverride w:ilvl="1">
+      <w:lvl w:ilvl="1">
+        <w:numFmt w:val="bullet"/>
+        <w:lvlText w:val=""/>
+        <w:lvlJc w:val="left"/>
+        <w:pPr>
+          <w:tabs>
+            <w:tab w:val="num" w:pos="1440"/>
+          </w:tabs>
+          <w:ind w:left="1440" w:hanging="360"/>
+        </w:pPr>
+        <w:rPr>
+          <w:rFonts w:ascii="Symbol" w:hAnsi="Symbol" w:hint="default"/>
+          <w:sz w:val="20"/>
+        </w:rPr>
+      </w:lvl>
+    </w:lvlOverride>
+  </w:num>
+  <w:num w:numId="9" w16cid:durableId="1418476525">
+    <w:abstractNumId w:val="2"/>
+    <w:lvlOverride w:ilvl="1">
+      <w:lvl w:ilvl="1">
+        <w:numFmt w:val="bullet"/>
+        <w:lvlText w:val=""/>
+        <w:lvlJc w:val="left"/>
+        <w:pPr>
+          <w:tabs>
+            <w:tab w:val="num" w:pos="1440"/>
+          </w:tabs>
+          <w:ind w:left="1440" w:hanging="360"/>
+        </w:pPr>
+        <w:rPr>
+          <w:rFonts w:ascii="Symbol" w:hAnsi="Symbol" w:hint="default"/>
+          <w:sz w:val="20"/>
+        </w:rPr>
+      </w:lvl>
+    </w:lvlOverride>
   </w:num>
 </w:numbering>
 </file>
@@ -2339,7 +3810,6 @@
   <w:style w:type="character" w:default="1" w:styleId="DefaultParagraphFont">
     <w:name w:val="Default Paragraph Font"/>
     <w:uiPriority w:val="1"/>
-    <w:semiHidden/>
     <w:unhideWhenUsed/>
   </w:style>
   <w:style w:type="table" w:default="1" w:styleId="TableNormal">
@@ -2653,6 +4123,34 @@
       <w:spacing w:val="5"/>
     </w:rPr>
   </w:style>
+  <w:style w:type="paragraph" w:styleId="NormalWeb">
+    <w:name w:val="Normal (Web)"/>
+    <w:basedOn w:val="Normal"/>
+    <w:uiPriority w:val="99"/>
+    <w:unhideWhenUsed/>
+    <w:rsid w:val="00E43DAC"/>
+    <w:pPr>
+      <w:spacing w:before="100" w:beforeAutospacing="1" w:after="100" w:afterAutospacing="1" w:line="240" w:lineRule="auto"/>
+    </w:pPr>
+    <w:rPr>
+      <w:rFonts w:eastAsia="Times New Roman" w:cs="Times New Roman"/>
+      <w:kern w:val="0"/>
+      <w14:ligatures w14:val="none"/>
+    </w:rPr>
+  </w:style>
+  <w:style w:type="character" w:styleId="HTMLCode">
+    <w:name w:val="HTML Code"/>
+    <w:basedOn w:val="DefaultParagraphFont"/>
+    <w:uiPriority w:val="99"/>
+    <w:semiHidden/>
+    <w:unhideWhenUsed/>
+    <w:rsid w:val="00E43DAC"/>
+    <w:rPr>
+      <w:rFonts w:ascii="Courier New" w:eastAsia="Times New Roman" w:hAnsi="Courier New" w:cs="Courier New"/>
+      <w:sz w:val="20"/>
+      <w:szCs w:val="20"/>
+    </w:rPr>
+  </w:style>
 </w:styles>
 </file>
 

</xml_diff>

<commit_message>
lab-02: stationery store mvc
</commit_message>
<xml_diff>
--- a/Labs_1/Lab1.docx
+++ b/Labs_1/Lab1.docx
@@ -1363,6 +1363,7 @@
         <w:rPr>
           <w:b/>
           <w:bCs/>
+          <w:noProof/>
         </w:rPr>
         <w:drawing>
           <wp:inline distT="0" distB="0" distL="0" distR="0" wp14:anchorId="2E5DFDE5" wp14:editId="376D19CA">
@@ -1410,6 +1411,9 @@
         <w:tab/>
       </w:r>
       <w:r>
+        <w:rPr>
+          <w:noProof/>
+        </w:rPr>
         <w:drawing>
           <wp:inline distT="0" distB="0" distL="0" distR="0" wp14:anchorId="712FABAD" wp14:editId="144E6299">
             <wp:extent cx="5764647" cy="2495550"/>
@@ -1480,6 +1484,9 @@
         <w:pStyle w:val="ListParagraph"/>
       </w:pPr>
       <w:r>
+        <w:rPr>
+          <w:noProof/>
+        </w:rPr>
         <w:drawing>
           <wp:inline distT="0" distB="0" distL="0" distR="0" wp14:anchorId="5A9F6811" wp14:editId="195CA11C">
             <wp:extent cx="5175250" cy="234434"/>
@@ -1522,6 +1529,9 @@
         <w:pStyle w:val="ListParagraph"/>
       </w:pPr>
       <w:r>
+        <w:rPr>
+          <w:noProof/>
+        </w:rPr>
         <w:drawing>
           <wp:inline distT="0" distB="0" distL="0" distR="0" wp14:anchorId="5C0A5F13" wp14:editId="7C4FAD22">
             <wp:extent cx="5187950" cy="2415501"/>
@@ -1572,6 +1582,9 @@
         <w:pStyle w:val="ListParagraph"/>
       </w:pPr>
       <w:r>
+        <w:rPr>
+          <w:noProof/>
+        </w:rPr>
         <w:drawing>
           <wp:inline distT="0" distB="0" distL="0" distR="0" wp14:anchorId="51C5FCEB" wp14:editId="47797F7A">
             <wp:extent cx="5235290" cy="215900"/>
@@ -1614,6 +1627,9 @@
         <w:tab/>
       </w:r>
       <w:r>
+        <w:rPr>
+          <w:noProof/>
+        </w:rPr>
         <w:drawing>
           <wp:inline distT="0" distB="0" distL="0" distR="0" wp14:anchorId="38411ECE" wp14:editId="14EAF1F9">
             <wp:extent cx="5277451" cy="2590800"/>
@@ -1666,6 +1682,9 @@
         <w:tab/>
       </w:r>
       <w:r>
+        <w:rPr>
+          <w:noProof/>
+        </w:rPr>
         <w:drawing>
           <wp:inline distT="0" distB="0" distL="0" distR="0" wp14:anchorId="22DBF38F" wp14:editId="735CBB89">
             <wp:extent cx="5448300" cy="242147"/>
@@ -1708,6 +1727,9 @@
         <w:ind w:firstLine="720"/>
       </w:pPr>
       <w:r>
+        <w:rPr>
+          <w:noProof/>
+        </w:rPr>
         <w:drawing>
           <wp:inline distT="0" distB="0" distL="0" distR="0" wp14:anchorId="3C060264" wp14:editId="31F3EA96">
             <wp:extent cx="5473700" cy="2792406"/>
@@ -1762,14 +1784,7 @@
           <w:b/>
           <w:bCs/>
         </w:rPr>
-        <w:t>Endpoint của Category</w:t>
-      </w:r>
-      <w:r>
-        <w:rPr>
-          <w:b/>
-          <w:bCs/>
-        </w:rPr>
-        <w:t>:</w:t>
+        <w:t>Endpoint của Category:</w:t>
       </w:r>
     </w:p>
     <w:p>
@@ -1792,6 +1807,7 @@
         <w:rPr>
           <w:b/>
           <w:bCs/>
+          <w:noProof/>
         </w:rPr>
         <w:drawing>
           <wp:inline distT="0" distB="0" distL="0" distR="0" wp14:anchorId="6DDB599C" wp14:editId="647377DA">
@@ -1845,6 +1861,7 @@
         <w:rPr>
           <w:b/>
           <w:bCs/>
+          <w:noProof/>
         </w:rPr>
         <w:drawing>
           <wp:inline distT="0" distB="0" distL="0" distR="0" wp14:anchorId="73B81DAD" wp14:editId="53F91F49">
@@ -1912,6 +1929,9 @@
         <w:pStyle w:val="ListParagraph"/>
       </w:pPr>
       <w:r>
+        <w:rPr>
+          <w:noProof/>
+        </w:rPr>
         <w:drawing>
           <wp:inline distT="0" distB="0" distL="0" distR="0" wp14:anchorId="27DB7E05" wp14:editId="36E9280E">
             <wp:extent cx="5492750" cy="213607"/>
@@ -1958,6 +1978,9 @@
         <w:tab/>
       </w:r>
       <w:r>
+        <w:rPr>
+          <w:noProof/>
+        </w:rPr>
         <w:drawing>
           <wp:inline distT="0" distB="0" distL="0" distR="0" wp14:anchorId="2267EC13" wp14:editId="429647EE">
             <wp:extent cx="5556250" cy="2610132"/>
@@ -2019,6 +2042,9 @@
         <w:ind w:left="690"/>
       </w:pPr>
       <w:r>
+        <w:rPr>
+          <w:noProof/>
+        </w:rPr>
         <w:drawing>
           <wp:inline distT="0" distB="0" distL="0" distR="0" wp14:anchorId="177F9BE0" wp14:editId="10B078DE">
             <wp:extent cx="5943600" cy="233680"/>
@@ -2061,6 +2087,9 @@
         <w:ind w:firstLine="720"/>
       </w:pPr>
       <w:r>
+        <w:rPr>
+          <w:noProof/>
+        </w:rPr>
         <w:drawing>
           <wp:inline distT="0" distB="0" distL="0" distR="0" wp14:anchorId="4A14BE40" wp14:editId="72102F6C">
             <wp:extent cx="5943600" cy="3056255"/>
@@ -2105,6 +2134,17 @@
       <w:r>
         <w:t>Xem chi tiết source code tại:</w:t>
       </w:r>
+      <w:r>
+        <w:t xml:space="preserve"> </w:t>
+      </w:r>
+      <w:hyperlink r:id="rId36" w:history="1">
+        <w:r>
+          <w:rPr>
+            <w:rStyle w:val="Hyperlink"/>
+          </w:rPr>
+          <w:t>https://github.com/tin1508/Asp.Net_TTH.git</w:t>
+        </w:r>
+      </w:hyperlink>
     </w:p>
     <w:p>
       <w:pPr>
@@ -2267,14 +2307,7 @@
           <w:b/>
           <w:bCs/>
         </w:rPr>
-        <w:t xml:space="preserve">+ </w:t>
-      </w:r>
-      <w:r>
-        <w:rPr>
-          <w:b/>
-          <w:bCs/>
-        </w:rPr>
-        <w:t>Validation:</w:t>
+        <w:t>+ Validation:</w:t>
       </w:r>
       <w:r>
         <w:t xml:space="preserve"> Sử dụng </w:t>
@@ -2287,13 +2320,7 @@
         <w:t>Data Annotations</w:t>
       </w:r>
       <w:r>
-        <w:t xml:space="preserve"> để ngăn chặn các lỗi nhập liệu như tên trống hoặc giá tiền </w:t>
-      </w:r>
-      <w:r>
-        <w:t xml:space="preserve">hay số lượng tồn kho </w:t>
-      </w:r>
-      <w:r>
-        <w:t>âm.</w:t>
+        <w:t xml:space="preserve"> để ngăn chặn các lỗi nhập liệu như tên trống hoặc giá tiền hay số lượng tồn kho âm.</w:t>
       </w:r>
     </w:p>
     <w:p>
@@ -2306,23 +2333,10 @@
           <w:b/>
           <w:bCs/>
         </w:rPr>
-        <w:t xml:space="preserve">+ </w:t>
-      </w:r>
-      <w:r>
-        <w:rPr>
-          <w:b/>
-          <w:bCs/>
-        </w:rPr>
-        <w:t>Service Logic:</w:t>
-      </w:r>
-      <w:r>
-        <w:t xml:space="preserve"> kiểm tra nghiệp vụ tầng Service. Ví dụ: Trước khi trừ kho, Service phải kiểm tra xem</w:t>
-      </w:r>
-      <w:r>
-        <w:t xml:space="preserve"> số lượng tồn kho</w:t>
-      </w:r>
-      <w:r>
-        <w:t xml:space="preserve"> có đủ cung cấp cho đơn hàng hay không.</w:t>
+        <w:t>+ Service Logic:</w:t>
+      </w:r>
+      <w:r>
+        <w:t xml:space="preserve"> kiểm tra nghiệp vụ tầng Service. Ví dụ: Trước khi trừ kho, Service phải kiểm tra xem số lượng tồn kho có đủ cung cấp cho đơn hàng hay không.</w:t>
       </w:r>
     </w:p>
     <w:p>
@@ -2348,10 +2362,7 @@
         <w:t>Global Exception Handler</w:t>
       </w:r>
       <w:r>
-        <w:t xml:space="preserve"> để bắt lỗi tập</w:t>
-      </w:r>
-      <w:r>
-        <w:t xml:space="preserve"> trung, vì nếu như dự án có hàng chục hay hàng trăm file, và có những exception giống nhau được sử dụng ở nhiều file thì nếu muốn thay đổi hay chỉnh sửa exception thì phải chỉnh hết 1 hoặc 100 hay 1000 exceptions, nên </w:t>
+        <w:t xml:space="preserve"> để bắt lỗi tập trung, vì nếu như dự án có hàng chục hay hàng trăm file, và có những exception giống nhau được sử dụng ở nhiều file thì nếu muốn thay đổi hay chỉnh sửa exception thì phải chỉnh hết 1 hoặc 100 hay 1000 exceptions, nên </w:t>
       </w:r>
       <w:r>
         <w:rPr>
@@ -2361,10 +2372,7 @@
         <w:t>Global Exception Handler</w:t>
       </w:r>
       <w:r>
-        <w:t xml:space="preserve"> sẽ giúp giải quyết được việc này.</w:t>
-      </w:r>
-      <w:r>
-        <w:t xml:space="preserve"> </w:t>
+        <w:t xml:space="preserve"> sẽ giúp giải quyết được việc này. </w:t>
       </w:r>
     </w:p>
     <w:p>
@@ -2391,33 +2399,17 @@
         <w:ind w:left="720"/>
       </w:pPr>
       <w:r>
-        <w:t>Em ưu tiên</w:t>
-      </w:r>
-      <w:r>
-        <w:t xml:space="preserve"> </w:t>
-      </w:r>
-      <w:r>
-        <w:rPr>
-          <w:b/>
-          <w:bCs/>
-        </w:rPr>
-        <w:t>k</w:t>
-      </w:r>
-      <w:r>
-        <w:rPr>
-          <w:b/>
-          <w:bCs/>
-        </w:rPr>
-        <w:t xml:space="preserve">ết nối Database </w:t>
-      </w:r>
-      <w:r>
-        <w:t>vì những mặt hạn chế ở câu 1. Nếu không</w:t>
-      </w:r>
-      <w:r>
-        <w:t xml:space="preserve"> có Database</w:t>
-      </w:r>
-      <w:r>
-        <w:t>, thì việc CRUD, tìm kiếm, phân trang… cũng vô nghĩa, vì dữ liệu đều mất sạch khi chạy lại chương trình.</w:t>
+        <w:t xml:space="preserve">Em ưu tiên </w:t>
+      </w:r>
+      <w:r>
+        <w:rPr>
+          <w:b/>
+          <w:bCs/>
+        </w:rPr>
+        <w:t xml:space="preserve">kết nối Database </w:t>
+      </w:r>
+      <w:r>
+        <w:t>vì những mặt hạn chế ở câu 1. Nếu không có Database, thì việc CRUD, tìm kiếm, phân trang… cũng vô nghĩa, vì dữ liệu đều mất sạch khi chạy lại chương trình.</w:t>
       </w:r>
     </w:p>
     <w:p>
@@ -2702,14 +2694,7 @@
           <w:b/>
           <w:bCs/>
         </w:rPr>
-        <w:t>Thứ 5,</w:t>
-      </w:r>
-      <w:r>
-        <w:rPr>
-          <w:b/>
-          <w:bCs/>
-        </w:rPr>
-        <w:t xml:space="preserve"> </w:t>
+        <w:t xml:space="preserve">Thứ 5, </w:t>
       </w:r>
       <w:r>
         <w:t>kiểm tra route mapping vì nếu chạy trên môi trường môi trường production thì route của nó có khi sẽ thay đổi. Ví dụ ở local là api/v1/products còn productions là /products.</w:t>
@@ -3810,6 +3795,7 @@
   <w:style w:type="character" w:default="1" w:styleId="DefaultParagraphFont">
     <w:name w:val="Default Paragraph Font"/>
     <w:uiPriority w:val="1"/>
+    <w:semiHidden/>
     <w:unhideWhenUsed/>
   </w:style>
   <w:style w:type="table" w:default="1" w:styleId="TableNormal">
@@ -4151,6 +4137,29 @@
       <w:szCs w:val="20"/>
     </w:rPr>
   </w:style>
+  <w:style w:type="character" w:styleId="Hyperlink">
+    <w:name w:val="Hyperlink"/>
+    <w:basedOn w:val="DefaultParagraphFont"/>
+    <w:uiPriority w:val="99"/>
+    <w:unhideWhenUsed/>
+    <w:rsid w:val="00214861"/>
+    <w:rPr>
+      <w:color w:val="467886" w:themeColor="hyperlink"/>
+      <w:u w:val="single"/>
+    </w:rPr>
+  </w:style>
+  <w:style w:type="character" w:styleId="UnresolvedMention">
+    <w:name w:val="Unresolved Mention"/>
+    <w:basedOn w:val="DefaultParagraphFont"/>
+    <w:uiPriority w:val="99"/>
+    <w:semiHidden/>
+    <w:unhideWhenUsed/>
+    <w:rsid w:val="00214861"/>
+    <w:rPr>
+      <w:color w:val="605E5C"/>
+      <w:shd w:val="clear" w:color="auto" w:fill="E1DFDD"/>
+    </w:rPr>
+  </w:style>
 </w:styles>
 </file>
 

</xml_diff>